<commit_message>
feat(analyst): add analyst consensus widget with Yahoo Finance integration
- Add new API route `/api/stocks/[ticker]/analyst` that fetches data via Python CLI script
- Create `AnalystInsightWidget` component displaying price targets, recommendations, and upgrades/downgrades
- Update `StockPageClient` to include the new widget
- Enhance `BrokerActivityWidget` to auto-detect available data range and disable exceeding duration presets
- Improve broker date filtering to clip to `broker_flow`'s actual range
- Remove redundant `raw_json` field from scraper output
- Update documentation to version 3.0 with detailed bandar detection algorithm
</commit_message>
<xml_diff>
--- a/IDX_AI_Pipeline_FRD.docx
+++ b/IDX_AI_Pipeline_FRD.docx
@@ -14211,6 +14211,723 @@
         <w:br w:type="page"/>
       </w:r>
     </w:p>
+    <w:p/>
+    <w:p>
+      <w:pPr/>
+      <w:r>
+        <w:t>5.4 Shared Scoring Configuration (TypeScript ↔ Python)</w:t>
+      </w:r>
+    </w:p>
+    <w:p/>
+    <w:p>
+      <w:r>
+        <w:rPr>
+          <w:rFonts w:ascii="Arial" w:cs="Arial" w:eastAsia="Arial" w:hAnsi="Arial"/>
+          <w:color w:val="7A5000"/>
+          <w:sz w:val="19"/>
+          <w:szCs w:val="19"/>
+        </w:rPr>
+        <w:t xml:space="preserve">Three TypeScript modules must be ported to Python for context_builder.py: signal-confidence.ts (491 lines), health-score.ts (85 lines), and valuation.ts (165 lines). To prevent threshold drift between the UI and AI context bundle, all scoring constants are extracted into a single shared JSON config file.</w:t>
+      </w:r>
+    </w:p>
+    <w:p/>
+    <w:p>
+      <w:r>
+        <w:rPr>
+          <w:rFonts w:ascii="Arial" w:cs="Arial" w:eastAsia="Arial" w:hAnsi="Arial"/>
+          <w:color w:val="7A5000"/>
+          <w:sz w:val="19"/>
+          <w:szCs w:val="19"/>
+        </w:rPr>
+        <w:t xml:space="preserve">New file: shared/scoring-config.json</w:t>
+      </w:r>
+    </w:p>
+    <w:p>
+      <w:r>
+        <w:rPr>
+          <w:rFonts w:ascii="Arial" w:cs="Arial" w:eastAsia="Arial" w:hAnsi="Arial"/>
+          <w:color w:val="7A5000"/>
+          <w:sz w:val="19"/>
+          <w:szCs w:val="19"/>
+        </w:rPr>
+        <w:t xml:space="preserve">Read by: TypeScript (web/src/lib/constants.ts) and Python (scripts/scoring/config.py)</w:t>
+      </w:r>
+    </w:p>
+    <w:p/>
+    <w:p>
+      <w:r>
+        <w:rPr>
+          <w:rFonts w:ascii="Arial" w:cs="Arial" w:eastAsia="Arial" w:hAnsi="Arial"/>
+          <w:color w:val="7A5000"/>
+          <w:sz w:val="19"/>
+          <w:szCs w:val="19"/>
+        </w:rPr>
+        <w:t xml:space="preserve">{</w:t>
+      </w:r>
+    </w:p>
+    <w:p>
+      <w:r>
+        <w:rPr>
+          <w:rFonts w:ascii="Arial" w:cs="Arial" w:eastAsia="Arial" w:hAnsi="Arial"/>
+          <w:color w:val="7A5000"/>
+          <w:sz w:val="19"/>
+          <w:szCs w:val="19"/>
+        </w:rPr>
+        <w:t xml:space="preserve">  "health_thresholds": {</w:t>
+      </w:r>
+    </w:p>
+    <w:p>
+      <w:r>
+        <w:rPr>
+          <w:rFonts w:ascii="Arial" w:cs="Arial" w:eastAsia="Arial" w:hAnsi="Arial"/>
+          <w:color w:val="7A5000"/>
+          <w:sz w:val="19"/>
+          <w:szCs w:val="19"/>
+        </w:rPr>
+        <w:t xml:space="preserve">    "roe":            { "green": 15,  "yellow": 8 },</w:t>
+      </w:r>
+    </w:p>
+    <w:p>
+      <w:r>
+        <w:rPr>
+          <w:rFonts w:ascii="Arial" w:cs="Arial" w:eastAsia="Arial" w:hAnsi="Arial"/>
+          <w:color w:val="7A5000"/>
+          <w:sz w:val="19"/>
+          <w:szCs w:val="19"/>
+        </w:rPr>
+        <w:t xml:space="preserve">    "net_margin":     { "green": 10,  "yellow": 5 },</w:t>
+      </w:r>
+    </w:p>
+    <w:p>
+      <w:r>
+        <w:rPr>
+          <w:rFonts w:ascii="Arial" w:cs="Arial" w:eastAsia="Arial" w:hAnsi="Arial"/>
+          <w:color w:val="7A5000"/>
+          <w:sz w:val="19"/>
+          <w:szCs w:val="19"/>
+        </w:rPr>
+        <w:t xml:space="preserve">    "gross_margin":   { "green": 30,  "yellow": 15 },</w:t>
+      </w:r>
+    </w:p>
+    <w:p>
+      <w:r>
+        <w:rPr>
+          <w:rFonts w:ascii="Arial" w:cs="Arial" w:eastAsia="Arial" w:hAnsi="Arial"/>
+          <w:color w:val="7A5000"/>
+          <w:sz w:val="19"/>
+          <w:szCs w:val="19"/>
+        </w:rPr>
+        <w:t xml:space="preserve">    "roa":            { "green": 8,   "yellow": 4 },</w:t>
+      </w:r>
+    </w:p>
+    <w:p>
+      <w:r>
+        <w:rPr>
+          <w:rFonts w:ascii="Arial" w:cs="Arial" w:eastAsia="Arial" w:hAnsi="Arial"/>
+          <w:color w:val="7A5000"/>
+          <w:sz w:val="19"/>
+          <w:szCs w:val="19"/>
+        </w:rPr>
+        <w:t xml:space="preserve">    "current_ratio":  { "green": 1.5, "yellow": 1.0 },</w:t>
+      </w:r>
+    </w:p>
+    <w:p>
+      <w:r>
+        <w:rPr>
+          <w:rFonts w:ascii="Arial" w:cs="Arial" w:eastAsia="Arial" w:hAnsi="Arial"/>
+          <w:color w:val="7A5000"/>
+          <w:sz w:val="19"/>
+          <w:szCs w:val="19"/>
+        </w:rPr>
+        <w:t xml:space="preserve">    "debt_to_equity": { "green": 1.0, "yellow": 2.0, "invert": true },</w:t>
+      </w:r>
+    </w:p>
+    <w:p>
+      <w:r>
+        <w:rPr>
+          <w:rFonts w:ascii="Arial" w:cs="Arial" w:eastAsia="Arial" w:hAnsi="Arial"/>
+          <w:color w:val="7A5000"/>
+          <w:sz w:val="19"/>
+          <w:szCs w:val="19"/>
+        </w:rPr>
+        <w:t xml:space="preserve">    "fcf":            { "type": "sign", "green": 0 }</w:t>
+      </w:r>
+    </w:p>
+    <w:p>
+      <w:r>
+        <w:rPr>
+          <w:rFonts w:ascii="Arial" w:cs="Arial" w:eastAsia="Arial" w:hAnsi="Arial"/>
+          <w:color w:val="7A5000"/>
+          <w:sz w:val="19"/>
+          <w:szCs w:val="19"/>
+        </w:rPr>
+        <w:t xml:space="preserve">  },</w:t>
+      </w:r>
+    </w:p>
+    <w:p>
+      <w:r>
+        <w:rPr>
+          <w:rFonts w:ascii="Arial" w:cs="Arial" w:eastAsia="Arial" w:hAnsi="Arial"/>
+          <w:color w:val="7A5000"/>
+          <w:sz w:val="19"/>
+          <w:szCs w:val="19"/>
+        </w:rPr>
+        <w:t xml:space="preserve">  "smart_money": {</w:t>
+      </w:r>
+    </w:p>
+    <w:p>
+      <w:r>
+        <w:rPr>
+          <w:rFonts w:ascii="Arial" w:cs="Arial" w:eastAsia="Arial" w:hAnsi="Arial"/>
+          <w:color w:val="7A5000"/>
+          <w:sz w:val="19"/>
+          <w:szCs w:val="19"/>
+        </w:rPr>
+        <w:t xml:space="preserve">    "broker_magnitude_tiers":     [0.10, 0.05, 0.02, 0.005],</w:t>
+      </w:r>
+    </w:p>
+    <w:p>
+      <w:r>
+        <w:rPr>
+          <w:rFonts w:ascii="Arial" w:cs="Arial" w:eastAsia="Arial" w:hAnsi="Arial"/>
+          <w:color w:val="7A5000"/>
+          <w:sz w:val="19"/>
+          <w:szCs w:val="19"/>
+        </w:rPr>
+        <w:t xml:space="preserve">    "broker_magnitude_scores":    [25, 20, 15, 10, 5],</w:t>
+      </w:r>
+    </w:p>
+    <w:p>
+      <w:r>
+        <w:rPr>
+          <w:rFonts w:ascii="Arial" w:cs="Arial" w:eastAsia="Arial" w:hAnsi="Arial"/>
+          <w:color w:val="7A5000"/>
+          <w:sz w:val="19"/>
+          <w:szCs w:val="19"/>
+        </w:rPr>
+        <w:t xml:space="preserve">    "broker_magnitude_max":       25,</w:t>
+      </w:r>
+    </w:p>
+    <w:p>
+      <w:r>
+        <w:rPr>
+          <w:rFonts w:ascii="Arial" w:cs="Arial" w:eastAsia="Arial" w:hAnsi="Arial"/>
+          <w:color w:val="7A5000"/>
+          <w:sz w:val="19"/>
+          <w:szCs w:val="19"/>
+        </w:rPr>
+        <w:t xml:space="preserve">    "foreign_alignment_max":      25,</w:t>
+      </w:r>
+    </w:p>
+    <w:p>
+      <w:r>
+        <w:rPr>
+          <w:rFonts w:ascii="Arial" w:cs="Arial" w:eastAsia="Arial" w:hAnsi="Arial"/>
+          <w:color w:val="7A5000"/>
+          <w:sz w:val="19"/>
+          <w:szCs w:val="19"/>
+        </w:rPr>
+        <w:t xml:space="preserve">    "foreign_dominance_tiers":    [0.5, 0.2],</w:t>
+      </w:r>
+    </w:p>
+    <w:p>
+      <w:r>
+        <w:rPr>
+          <w:rFonts w:ascii="Arial" w:cs="Arial" w:eastAsia="Arial" w:hAnsi="Arial"/>
+          <w:color w:val="7A5000"/>
+          <w:sz w:val="19"/>
+          <w:szCs w:val="19"/>
+        </w:rPr>
+        <w:t xml:space="preserve">    "foreign_dominance_muls":     [1.0, 0.8, 0.6],</w:t>
+      </w:r>
+    </w:p>
+    <w:p>
+      <w:r>
+        <w:rPr>
+          <w:rFonts w:ascii="Arial" w:cs="Arial" w:eastAsia="Arial" w:hAnsi="Arial"/>
+          <w:color w:val="7A5000"/>
+          <w:sz w:val="19"/>
+          <w:szCs w:val="19"/>
+        </w:rPr>
+        <w:t xml:space="preserve">    "bandar_confirmation_max":    20,</w:t>
+      </w:r>
+    </w:p>
+    <w:p>
+      <w:r>
+        <w:rPr>
+          <w:rFonts w:ascii="Arial" w:cs="Arial" w:eastAsia="Arial" w:hAnsi="Arial"/>
+          <w:color w:val="7A5000"/>
+          <w:sz w:val="19"/>
+          <w:szCs w:val="19"/>
+        </w:rPr>
+        <w:t xml:space="preserve">    "bandar_blend_weights":       [0.6, 0.4],</w:t>
+      </w:r>
+    </w:p>
+    <w:p>
+      <w:r>
+        <w:rPr>
+          <w:rFonts w:ascii="Arial" w:cs="Arial" w:eastAsia="Arial" w:hAnsi="Arial"/>
+          <w:color w:val="7A5000"/>
+          <w:sz w:val="19"/>
+          <w:szCs w:val="19"/>
+        </w:rPr>
+        <w:t xml:space="preserve">    "bandar_aligned_scores":      { "strong": 20, "normal": 15, "weak": 10 },</w:t>
+      </w:r>
+    </w:p>
+    <w:p>
+      <w:r>
+        <w:rPr>
+          <w:rFonts w:ascii="Arial" w:cs="Arial" w:eastAsia="Arial" w:hAnsi="Arial"/>
+          <w:color w:val="7A5000"/>
+          <w:sz w:val="19"/>
+          <w:szCs w:val="19"/>
+        </w:rPr>
+        <w:t xml:space="preserve">    "bandar_contradict_scores":   { "strong": 2,  "normal": 5,  "weak": 7 },</w:t>
+      </w:r>
+    </w:p>
+    <w:p>
+      <w:r>
+        <w:rPr>
+          <w:rFonts w:ascii="Arial" w:cs="Arial" w:eastAsia="Arial" w:hAnsi="Arial"/>
+          <w:color w:val="7A5000"/>
+          <w:sz w:val="19"/>
+          <w:szCs w:val="19"/>
+        </w:rPr>
+        <w:t xml:space="preserve">    "insider_weight_max":         15,</w:t>
+      </w:r>
+    </w:p>
+    <w:p>
+      <w:r>
+        <w:rPr>
+          <w:rFonts w:ascii="Arial" w:cs="Arial" w:eastAsia="Arial" w:hAnsi="Arial"/>
+          <w:color w:val="7A5000"/>
+          <w:sz w:val="19"/>
+          <w:szCs w:val="19"/>
+        </w:rPr>
+        <w:t xml:space="preserve">    "insider_value_tiers":        [10000000000, 1000000000, 100000000],</w:t>
+      </w:r>
+    </w:p>
+    <w:p>
+      <w:r>
+        <w:rPr>
+          <w:rFonts w:ascii="Arial" w:cs="Arial" w:eastAsia="Arial" w:hAnsi="Arial"/>
+          <w:color w:val="7A5000"/>
+          <w:sz w:val="19"/>
+          <w:szCs w:val="19"/>
+        </w:rPr>
+        <w:t xml:space="preserve">    "insider_value_scores":       [15, 12, 9, 6],</w:t>
+      </w:r>
+    </w:p>
+    <w:p>
+      <w:r>
+        <w:rPr>
+          <w:rFonts w:ascii="Arial" w:cs="Arial" w:eastAsia="Arial" w:hAnsi="Arial"/>
+          <w:color w:val="7A5000"/>
+          <w:sz w:val="19"/>
+          <w:szCs w:val="19"/>
+        </w:rPr>
+        <w:t xml:space="preserve">    "insider_ownership_bonus":    2,</w:t>
+      </w:r>
+    </w:p>
+    <w:p>
+      <w:r>
+        <w:rPr>
+          <w:rFonts w:ascii="Arial" w:cs="Arial" w:eastAsia="Arial" w:hAnsi="Arial"/>
+          <w:color w:val="7A5000"/>
+          <w:sz w:val="19"/>
+          <w:szCs w:val="19"/>
+        </w:rPr>
+        <w:t xml:space="preserve">    "insider_ownership_threshold": 1.0,</w:t>
+      </w:r>
+    </w:p>
+    <w:p>
+      <w:r>
+        <w:rPr>
+          <w:rFonts w:ascii="Arial" w:cs="Arial" w:eastAsia="Arial" w:hAnsi="Arial"/>
+          <w:color w:val="7A5000"/>
+          <w:sz w:val="19"/>
+          <w:szCs w:val="19"/>
+        </w:rPr>
+        <w:t xml:space="preserve">    "broker_concentration_max":   15,</w:t>
+      </w:r>
+    </w:p>
+    <w:p>
+      <w:r>
+        <w:rPr>
+          <w:rFonts w:ascii="Arial" w:cs="Arial" w:eastAsia="Arial" w:hAnsi="Arial"/>
+          <w:color w:val="7A5000"/>
+          <w:sz w:val="19"/>
+          <w:szCs w:val="19"/>
+        </w:rPr>
+        <w:t xml:space="preserve">    "concentration_tiers":        [30, 20, 10],</w:t>
+      </w:r>
+    </w:p>
+    <w:p>
+      <w:r>
+        <w:rPr>
+          <w:rFonts w:ascii="Arial" w:cs="Arial" w:eastAsia="Arial" w:hAnsi="Arial"/>
+          <w:color w:val="7A5000"/>
+          <w:sz w:val="19"/>
+          <w:szCs w:val="19"/>
+        </w:rPr>
+        <w:t xml:space="preserve">    "concentration_scores":       [15, 12, 9, 5],</w:t>
+      </w:r>
+    </w:p>
+    <w:p>
+      <w:r>
+        <w:rPr>
+          <w:rFonts w:ascii="Arial" w:cs="Arial" w:eastAsia="Arial" w:hAnsi="Arial"/>
+          <w:color w:val="7A5000"/>
+          <w:sz w:val="19"/>
+          <w:szCs w:val="19"/>
+        </w:rPr>
+        <w:t xml:space="preserve">    "strength_labels": [</w:t>
+      </w:r>
+    </w:p>
+    <w:p>
+      <w:r>
+        <w:rPr>
+          <w:rFonts w:ascii="Arial" w:cs="Arial" w:eastAsia="Arial" w:hAnsi="Arial"/>
+          <w:color w:val="7A5000"/>
+          <w:sz w:val="19"/>
+          <w:szCs w:val="19"/>
+        </w:rPr>
+        <w:t xml:space="preserve">      { "min": 80, "label": "Sangat Kuat" },</w:t>
+      </w:r>
+    </w:p>
+    <w:p>
+      <w:r>
+        <w:rPr>
+          <w:rFonts w:ascii="Arial" w:cs="Arial" w:eastAsia="Arial" w:hAnsi="Arial"/>
+          <w:color w:val="7A5000"/>
+          <w:sz w:val="19"/>
+          <w:szCs w:val="19"/>
+        </w:rPr>
+        <w:t xml:space="preserve">      { "min": 60, "label": "Kuat" },</w:t>
+      </w:r>
+    </w:p>
+    <w:p>
+      <w:r>
+        <w:rPr>
+          <w:rFonts w:ascii="Arial" w:cs="Arial" w:eastAsia="Arial" w:hAnsi="Arial"/>
+          <w:color w:val="7A5000"/>
+          <w:sz w:val="19"/>
+          <w:szCs w:val="19"/>
+        </w:rPr>
+        <w:t xml:space="preserve">      { "min": 40, "label": "Sedang" },</w:t>
+      </w:r>
+    </w:p>
+    <w:p>
+      <w:r>
+        <w:rPr>
+          <w:rFonts w:ascii="Arial" w:cs="Arial" w:eastAsia="Arial" w:hAnsi="Arial"/>
+          <w:color w:val="7A5000"/>
+          <w:sz w:val="19"/>
+          <w:szCs w:val="19"/>
+        </w:rPr>
+        <w:t xml:space="preserve">      { "min": 20, "label": "Lemah" },</w:t>
+      </w:r>
+    </w:p>
+    <w:p>
+      <w:r>
+        <w:rPr>
+          <w:rFonts w:ascii="Arial" w:cs="Arial" w:eastAsia="Arial" w:hAnsi="Arial"/>
+          <w:color w:val="7A5000"/>
+          <w:sz w:val="19"/>
+          <w:szCs w:val="19"/>
+        </w:rPr>
+        <w:t xml:space="preserve">      { "min": 0,  "label": "Sangat Lemah" }</w:t>
+      </w:r>
+    </w:p>
+    <w:p>
+      <w:r>
+        <w:rPr>
+          <w:rFonts w:ascii="Arial" w:cs="Arial" w:eastAsia="Arial" w:hAnsi="Arial"/>
+          <w:color w:val="7A5000"/>
+          <w:sz w:val="19"/>
+          <w:szCs w:val="19"/>
+        </w:rPr>
+        <w:t xml:space="preserve">    ]</w:t>
+      </w:r>
+    </w:p>
+    <w:p>
+      <w:r>
+        <w:rPr>
+          <w:rFonts w:ascii="Arial" w:cs="Arial" w:eastAsia="Arial" w:hAnsi="Arial"/>
+          <w:color w:val="7A5000"/>
+          <w:sz w:val="19"/>
+          <w:szCs w:val="19"/>
+        </w:rPr>
+        <w:t xml:space="preserve">  },</w:t>
+      </w:r>
+    </w:p>
+    <w:p>
+      <w:r>
+        <w:rPr>
+          <w:rFonts w:ascii="Arial" w:cs="Arial" w:eastAsia="Arial" w:hAnsi="Arial"/>
+          <w:color w:val="7A5000"/>
+          <w:sz w:val="19"/>
+          <w:szCs w:val="19"/>
+        </w:rPr>
+        <w:t xml:space="preserve">  "valuation": {</w:t>
+      </w:r>
+    </w:p>
+    <w:p>
+      <w:r>
+        <w:rPr>
+          <w:rFonts w:ascii="Arial" w:cs="Arial" w:eastAsia="Arial" w:hAnsi="Arial"/>
+          <w:color w:val="7A5000"/>
+          <w:sz w:val="19"/>
+          <w:szCs w:val="19"/>
+        </w:rPr>
+        <w:t xml:space="preserve">    "risk_free_rate":       6.75,</w:t>
+      </w:r>
+    </w:p>
+    <w:p>
+      <w:r>
+        <w:rPr>
+          <w:rFonts w:ascii="Arial" w:cs="Arial" w:eastAsia="Arial" w:hAnsi="Arial"/>
+          <w:color w:val="7A5000"/>
+          <w:sz w:val="19"/>
+          <w:szCs w:val="19"/>
+        </w:rPr>
+        <w:t xml:space="preserve">    "equity_risk_premium":  6.25,</w:t>
+      </w:r>
+    </w:p>
+    <w:p>
+      <w:r>
+        <w:rPr>
+          <w:rFonts w:ascii="Arial" w:cs="Arial" w:eastAsia="Arial" w:hAnsi="Arial"/>
+          <w:color w:val="7A5000"/>
+          <w:sz w:val="19"/>
+          <w:szCs w:val="19"/>
+        </w:rPr>
+        <w:t xml:space="preserve">    "base_wacc":            13.0,</w:t>
+      </w:r>
+    </w:p>
+    <w:p>
+      <w:r>
+        <w:rPr>
+          <w:rFonts w:ascii="Arial" w:cs="Arial" w:eastAsia="Arial" w:hAnsi="Arial"/>
+          <w:color w:val="7A5000"/>
+          <w:sz w:val="19"/>
+          <w:szCs w:val="19"/>
+        </w:rPr>
+        <w:t xml:space="preserve">    "terminal_growth":      3.0,</w:t>
+      </w:r>
+    </w:p>
+    <w:p>
+      <w:r>
+        <w:rPr>
+          <w:rFonts w:ascii="Arial" w:cs="Arial" w:eastAsia="Arial" w:hAnsi="Arial"/>
+          <w:color w:val="7A5000"/>
+          <w:sz w:val="19"/>
+          <w:szCs w:val="19"/>
+        </w:rPr>
+        <w:t xml:space="preserve">    "scenario_variation":   0.10,</w:t>
+      </w:r>
+    </w:p>
+    <w:p>
+      <w:r>
+        <w:rPr>
+          <w:rFonts w:ascii="Arial" w:cs="Arial" w:eastAsia="Arial" w:hAnsi="Arial"/>
+          <w:color w:val="7A5000"/>
+          <w:sz w:val="19"/>
+          <w:szCs w:val="19"/>
+        </w:rPr>
+        <w:t xml:space="preserve">    "graham_constant":      22.5,</w:t>
+      </w:r>
+    </w:p>
+    <w:p>
+      <w:r>
+        <w:rPr>
+          <w:rFonts w:ascii="Arial" w:cs="Arial" w:eastAsia="Arial" w:hAnsi="Arial"/>
+          <w:color w:val="7A5000"/>
+          <w:sz w:val="19"/>
+          <w:szCs w:val="19"/>
+        </w:rPr>
+        <w:t xml:space="preserve">    "mos_undervalued":      30,</w:t>
+      </w:r>
+    </w:p>
+    <w:p>
+      <w:r>
+        <w:rPr>
+          <w:rFonts w:ascii="Arial" w:cs="Arial" w:eastAsia="Arial" w:hAnsi="Arial"/>
+          <w:color w:val="7A5000"/>
+          <w:sz w:val="19"/>
+          <w:szCs w:val="19"/>
+        </w:rPr>
+        <w:t xml:space="preserve">    "mos_fairly_valued":    0</w:t>
+      </w:r>
+    </w:p>
+    <w:p>
+      <w:r>
+        <w:rPr>
+          <w:rFonts w:ascii="Arial" w:cs="Arial" w:eastAsia="Arial" w:hAnsi="Arial"/>
+          <w:color w:val="7A5000"/>
+          <w:sz w:val="19"/>
+          <w:szCs w:val="19"/>
+        </w:rPr>
+        <w:t xml:space="preserve">  }</w:t>
+      </w:r>
+    </w:p>
+    <w:p>
+      <w:r>
+        <w:rPr>
+          <w:rFonts w:ascii="Arial" w:cs="Arial" w:eastAsia="Arial" w:hAnsi="Arial"/>
+          <w:color w:val="7A5000"/>
+          <w:sz w:val="19"/>
+          <w:szCs w:val="19"/>
+        </w:rPr>
+        <w:t xml:space="preserve">}</w:t>
+      </w:r>
+    </w:p>
+    <w:p/>
+    <w:p>
+      <w:r>
+        <w:rPr>
+          <w:rFonts w:ascii="Arial" w:cs="Arial" w:eastAsia="Arial" w:hAnsi="Arial"/>
+          <w:color w:val="7A5000"/>
+          <w:sz w:val="19"/>
+          <w:szCs w:val="19"/>
+        </w:rPr>
+        <w:t xml:space="preserve">Implementation rules:</w:t>
+      </w:r>
+    </w:p>
+    <w:p>
+      <w:r>
+        <w:rPr>
+          <w:rFonts w:ascii="Arial" w:cs="Arial" w:eastAsia="Arial" w:hAnsi="Arial"/>
+          <w:color w:val="7A5000"/>
+          <w:sz w:val="19"/>
+          <w:szCs w:val="19"/>
+        </w:rPr>
+        <w:t xml:space="preserve">  • TypeScript: web/src/lib/constants.ts reads from shared/scoring-config.json at build time (import JSON). Replace existing hardcoded HEALTH_THRESHOLDS and valuation constants.</w:t>
+      </w:r>
+    </w:p>
+    <w:p>
+      <w:r>
+        <w:rPr>
+          <w:rFonts w:ascii="Arial" w:cs="Arial" w:eastAsia="Arial" w:hAnsi="Arial"/>
+          <w:color w:val="7A5000"/>
+          <w:sz w:val="19"/>
+          <w:szCs w:val="19"/>
+        </w:rPr>
+        <w:t xml:space="preserve">  • Python: scripts/scoring/config.py loads the same file. All scoring modules import from config.py.</w:t>
+      </w:r>
+    </w:p>
+    <w:p>
+      <w:r>
+        <w:rPr>
+          <w:rFonts w:ascii="Arial" w:cs="Arial" w:eastAsia="Arial" w:hAnsi="Arial"/>
+          <w:color w:val="7A5000"/>
+          <w:sz w:val="19"/>
+          <w:szCs w:val="19"/>
+        </w:rPr>
+        <w:t xml:space="preserve">  • When a threshold changes: edit scoring-config.json once. Both languages pick it up automatically.</w:t>
+      </w:r>
+    </w:p>
+    <w:p>
+      <w:r>
+        <w:rPr>
+          <w:rFonts w:ascii="Arial" w:cs="Arial" w:eastAsia="Arial" w:hAnsi="Arial"/>
+          <w:color w:val="7A5000"/>
+          <w:sz w:val="19"/>
+          <w:szCs w:val="19"/>
+        </w:rPr>
+        <w:t xml:space="preserve">  • The narrative generator (generateNarrative in signal-confidence.ts) is NOT shared — it is UI-only and not part of the AI context bundle. The Python port only needs computeConfidence() and its 5 component scorers.</w:t>
+      </w:r>
+    </w:p>
+    <w:p>
+      <w:r>
+        <w:rPr>
+          <w:rFonts w:ascii="Arial" w:cs="Arial" w:eastAsia="Arial" w:hAnsi="Arial"/>
+          <w:color w:val="7A5000"/>
+          <w:sz w:val="19"/>
+          <w:szCs w:val="19"/>
+        </w:rPr>
+        <w:t xml:space="preserve">  • Scoring logic (if/else chains, clamp, alignment checks) is duplicated in both languages — only the threshold values are shared.</w:t>
+      </w:r>
+    </w:p>
+    <w:p/>
+    <w:p>
+      <w:r>
+        <w:rPr>
+          <w:rFonts w:ascii="Arial" w:cs="Arial" w:eastAsia="Arial" w:hAnsi="Arial"/>
+          <w:color w:val="7A5000"/>
+          <w:sz w:val="19"/>
+          <w:szCs w:val="19"/>
+        </w:rPr>
+        <w:t xml:space="preserve">Validation (implementation step):</w:t>
+      </w:r>
+    </w:p>
+    <w:p>
+      <w:r>
+        <w:rPr>
+          <w:rFonts w:ascii="Arial" w:cs="Arial" w:eastAsia="Arial" w:hAnsi="Arial"/>
+          <w:color w:val="7A5000"/>
+          <w:sz w:val="19"/>
+          <w:szCs w:val="19"/>
+        </w:rPr>
+        <w:t xml:space="preserve">  After Python port is complete, run a comparison test on 5 blue-chip tickers (BBCA, BBRI, BMRI, TLKM, ASII):</w:t>
+      </w:r>
+    </w:p>
+    <w:p>
+      <w:r>
+        <w:rPr>
+          <w:rFonts w:ascii="Arial" w:cs="Arial" w:eastAsia="Arial" w:hAnsi="Arial"/>
+          <w:color w:val="7A5000"/>
+          <w:sz w:val="19"/>
+          <w:szCs w:val="19"/>
+        </w:rPr>
+        <w:t xml:space="preserve">  • Compute smart_money confidence via TypeScript (from the UI/API) and via Python (from context_builder.py)</w:t>
+      </w:r>
+    </w:p>
+    <w:p>
+      <w:r>
+        <w:rPr>
+          <w:rFonts w:ascii="Arial" w:cs="Arial" w:eastAsia="Arial" w:hAnsi="Arial"/>
+          <w:color w:val="7A5000"/>
+          <w:sz w:val="19"/>
+          <w:szCs w:val="19"/>
+        </w:rPr>
+        <w:t xml:space="preserve">  • Compute health_score via TypeScript and Python</w:t>
+      </w:r>
+    </w:p>
+    <w:p>
+      <w:r>
+        <w:rPr>
+          <w:rFonts w:ascii="Arial" w:cs="Arial" w:eastAsia="Arial" w:hAnsi="Arial"/>
+          <w:color w:val="7A5000"/>
+          <w:sz w:val="19"/>
+          <w:szCs w:val="19"/>
+        </w:rPr>
+        <w:t xml:space="preserve">  • Compute Graham number + DCF scenarios via both</w:t>
+      </w:r>
+    </w:p>
+    <w:p>
+      <w:r>
+        <w:rPr>
+          <w:rFonts w:ascii="Arial" w:cs="Arial" w:eastAsia="Arial" w:hAnsi="Arial"/>
+          <w:color w:val="7A5000"/>
+          <w:sz w:val="19"/>
+          <w:szCs w:val="19"/>
+        </w:rPr>
+        <w:t xml:space="preserve">  • Assert: all scores match within ±1 point (rounding tolerance)</w:t>
+      </w:r>
+    </w:p>
+    <w:p>
+      <w:r>
+        <w:rPr>
+          <w:rFonts w:ascii="Arial" w:cs="Arial" w:eastAsia="Arial" w:hAnsi="Arial"/>
+          <w:color w:val="7A5000"/>
+          <w:sz w:val="19"/>
+          <w:szCs w:val="19"/>
+        </w:rPr>
+        <w:t xml:space="preserve">  • If delta &gt; 1 for any ticker: investigate logic divergence before proceeding</w:t>
+      </w:r>
+    </w:p>
+    <w:p/>
     <w:p>
       <w:pPr>
         <w:pStyle w:val="Heading1"/>

</xml_diff>

<commit_message>
feat(web): add sector peer percentiles and improve UI components
- Add sector peer percentile ranking for financial ratios (growth, strength, value)
- Implement comprehensive peer comparison with percentile calculations and visual indicators
- Replace RatiosWidget with enhanced CompanyMetricsWidget showing peer rankings
- Add collapsible sections to SectorOutlookWidget and ProductsWidget for better UX
- Update styling across multiple components (CAGRTable, HealthScorecard, ValuationWidget) to match design system
- Fix banking sector data handling by overriding meaningless zero values for D/E, current ratio, and interest coverage
- Add pytest configuration and test files for Phase 6 scoring pipeline
- Update requirements.txt with AI and testing dependencies
- Add shared configuration files for scoring and macro context
- Improve ShareholdersWidget with scrollable list and better visual hierarchy
- Add TTM data handling for valuation metrics while maintaining trend accuracy
</commit_message>
<xml_diff>
--- a/IDX_AI_Pipeline_FRD.docx
+++ b/IDX_AI_Pipeline_FRD.docx
@@ -219,15 +219,7 @@
               <w:spacing w:after="0"/>
             </w:pPr>
             <w:r>
-              <w:rPr>
-                <w:rFonts w:ascii="Arial" w:cs="Arial" w:eastAsia="Arial" w:hAnsi="Arial"/>
-                <w:b w:val="false"/>
-                <w:bCs w:val="false"/>
-                <w:color w:val="222222"/>
-                <w:sz w:val="19"/>
-                <w:szCs w:val="19"/>
-              </w:rPr>
-              <w:t xml:space="preserve">1.0</w:t>
+              <w:t>2.0</w:t>
             </w:r>
           </w:p>
         </w:tc>
@@ -291,15 +283,7 @@
               <w:spacing w:after="0"/>
             </w:pPr>
             <w:r>
-              <w:rPr>
-                <w:rFonts w:ascii="Arial" w:cs="Arial" w:eastAsia="Arial" w:hAnsi="Arial"/>
-                <w:b w:val="false"/>
-                <w:bCs w:val="false"/>
-                <w:color w:val="222222"/>
-                <w:sz w:val="19"/>
-                <w:szCs w:val="19"/>
-              </w:rPr>
-              <w:t xml:space="preserve">New — Ready for Implementation</w:t>
+              <w:t>Revised — Simulation-validated, ready for implementation</w:t>
             </w:r>
           </w:p>
         </w:tc>
@@ -717,15 +701,7 @@
               <w:spacing w:after="0"/>
             </w:pPr>
             <w:r>
-              <w:rPr>
-                <w:rFonts w:ascii="Arial" w:cs="Arial" w:eastAsia="Arial" w:hAnsi="Arial"/>
-                <w:b w:val="false"/>
-                <w:bCs w:val="false"/>
-                <w:color w:val="222222"/>
-                <w:sz w:val="19"/>
-                <w:szCs w:val="19"/>
-              </w:rPr>
-              <w:t xml:space="preserve">2026-03-26</w:t>
+              <w:t>2026-03-30</w:t>
             </w:r>
           </w:p>
         </w:tc>
@@ -2241,7 +2217,7 @@
         <w:spacing w:after="100"/>
       </w:pPr>
       <w:r>
-        <w:t>All rules are applied in sequence. Each rule produces a flag update. Rules are deterministic — no human judgment required. 10 rules total (1 deferred to Phase 6.1).</w:t>
+        <w:t>All rules are applied in sequence. Each rule produces a flag update. Rules are deterministic — no human judgment required. 13 rules total (2 deferred to Phase 6.1: restatement detection and stock split adjustment).</w:t>
       </w:r>
     </w:p>
     <w:p>
@@ -3654,6 +3630,165 @@
           <w:p>
             <w:r>
               <w:t>IPO year row: usability_flag = 'exclude' for that year. If &lt; 3 full years: ready_for_ai = FALSE, data_gap_flags includes 'IPO {year}: insufficient post-IPO history ({n} full years, minimum 3 required)'</w:t>
+            </w:r>
+          </w:p>
+        </w:tc>
+      </w:tr>
+      <w:tr>
+        <w:tc>
+          <w:tcPr>
+            <w:tcW w:type="dxa" w:w="2200"/>
+          </w:tcPr>
+          <w:p>
+            <w:r>
+              <w:rPr>
+                <w:b/>
+              </w:rPr>
+              <w:t>Banking zero-override</w:t>
+            </w:r>
+          </w:p>
+          <w:p>
+            <w:r>
+              <w:rPr>
+                <w:i/>
+              </w:rPr>
+              <w:t>(NEW)</w:t>
+            </w:r>
+          </w:p>
+        </w:tc>
+        <w:tc>
+          <w:tcPr>
+            <w:tcW w:type="dxa" w:w="2000"/>
+          </w:tcPr>
+          <w:p>
+            <w:r>
+              <w:t>For banking stocks (subsector=Bank or sector contains Finance): if debt_to_equity, current_ratio, or interest_coverage == 0.0 for all years, Stockbit stores 0 instead of NULL. Override to NULL before normalization to prevent meaningless flat/R²=1.0 trends on constant zeros.</w:t>
+            </w:r>
+          </w:p>
+        </w:tc>
+        <w:tc>
+          <w:tcPr>
+            <w:tcW w:type="dxa" w:w="2200"/>
+          </w:tcPr>
+          <w:p>
+            <w:r>
+              <w:t>Set affected fields to NULL in cleaned rows</w:t>
+            </w:r>
+          </w:p>
+        </w:tc>
+        <w:tc>
+          <w:tcPr>
+            <w:tcW w:type="dxa" w:w="2960"/>
+          </w:tcPr>
+          <w:p>
+            <w:r>
+              <w:t>cleaner_notes includes "banking_zero_override: {metric} set to NULL (Stockbit stores 0 for banks)"</w:t>
+            </w:r>
+          </w:p>
+        </w:tc>
+      </w:tr>
+      <w:tr>
+        <w:tc>
+          <w:tcPr>
+            <w:tcW w:type="dxa" w:w="2200"/>
+          </w:tcPr>
+          <w:p>
+            <w:r>
+              <w:rPr>
+                <w:b/>
+              </w:rPr>
+              <w:t>TTM/keystats data handling</w:t>
+            </w:r>
+          </w:p>
+          <w:p>
+            <w:r>
+              <w:rPr>
+                <w:i/>
+              </w:rPr>
+              <w:t>(NEW)</w:t>
+            </w:r>
+          </w:p>
+        </w:tc>
+        <w:tc>
+          <w:tcPr>
+            <w:tcW w:type="dxa" w:w="2000"/>
+          </w:tcPr>
+          <w:p>
+            <w:r>
+              <w:t>If year &gt;= current_year AND source contains "keystats": this is TTM (trailing twelve months) data, not a published annual report. Values are often rounded, dividends_paid is NULL, and the row nearly duplicates the prior year. Detected by: year &gt;= date.today().year AND "keystats" in source.</w:t>
+            </w:r>
+          </w:p>
+        </w:tc>
+        <w:tc>
+          <w:tcPr>
+            <w:tcW w:type="dxa" w:w="2200"/>
+          </w:tcPr>
+          <w:p>
+            <w:r>
+              <w:t>Flag as use_with_caution. Exclude from CAGR and trend computation. For valuation metrics (PE, PB, EPS), use TTM as latest display value but published annual for trend.</w:t>
+            </w:r>
+          </w:p>
+        </w:tc>
+        <w:tc>
+          <w:tcPr>
+            <w:tcW w:type="dxa" w:w="2960"/>
+          </w:tcPr>
+          <w:p>
+            <w:r>
+              <w:t>usability_flag = "use_with_caution". cleaner_notes: "ttm_estimate_{year}: keystats data, not published annual report"</w:t>
+            </w:r>
+          </w:p>
+        </w:tc>
+      </w:tr>
+      <w:tr>
+        <w:tc>
+          <w:tcPr>
+            <w:tcW w:type="dxa" w:w="2200"/>
+          </w:tcPr>
+          <w:p>
+            <w:r>
+              <w:rPr>
+                <w:b/>
+              </w:rPr>
+              <w:t>Stock split adjustment</w:t>
+            </w:r>
+          </w:p>
+          <w:p>
+            <w:r>
+              <w:rPr>
+                <w:i/>
+              </w:rPr>
+              <w:t>(DEFERRED — v1)</w:t>
+            </w:r>
+          </w:p>
+        </w:tc>
+        <w:tc>
+          <w:tcPr>
+            <w:tcW w:type="dxa" w:w="2000"/>
+          </w:tcPr>
+          <w:p>
+            <w:r>
+              <w:t>Deferred to Phase 6.1. Per-share metrics (EPS, BVPS, DPS) are affected by stock splits/bonus shares. Without adjustment, a 2:1 split causes EPS to show -50% YoY while net income is flat, producing misleading "strong_down" trends (confirmed in BBCA simulation). Detection: EPS drops &gt;40% YoY while net_income is flat/up — probable split. Adjustment: divide pre-split per-share values by split ratio. Source: yfinance splits data or corporate_events table.</w:t>
+            </w:r>
+          </w:p>
+        </w:tc>
+        <w:tc>
+          <w:tcPr>
+            <w:tcW w:type="dxa" w:w="2200"/>
+          </w:tcPr>
+          <w:p>
+            <w:r>
+              <w:t>No action in v1. Per-share trend signals flagged as unreliable when R² &lt; 0.5.</w:t>
+            </w:r>
+          </w:p>
+        </w:tc>
+        <w:tc>
+          <w:tcPr>
+            <w:tcW w:type="dxa" w:w="2960"/>
+          </w:tcPr>
+          <w:p>
+            <w:r>
+              <w:t>cleaner_notes: "per_share_split_unadjusted: EPS/BVPS/DPS trends may be distorted by stock splits"</w:t>
             </w:r>
           </w:p>
         </w:tc>
@@ -9438,6 +9573,18 @@
         <w:t xml:space="preserve">  "data_as_of":   "2026-03-26",</w:t>
       </w:r>
     </w:p>
+    <w:p/>
+    <w:p>
+      <w:r>
+        <w:rPr>
+          <w:rFonts w:ascii="Courier New" w:cs="Courier New" w:eastAsia="Courier New" w:hAnsi="Courier New"/>
+          <w:color w:val="0D2B4E"/>
+          <w:sz w:val="17"/>
+          <w:szCs w:val="17"/>
+        </w:rPr>
+        <w:t xml:space="preserve">  "macro_context":   { ... },   // Section 4.2.9 (NEW)</w:t>
+      </w:r>
+    </w:p>
     <w:p>
       <w:pPr>
         <w:shd w:fill="F2F6FC" w:val="clear"/>
@@ -12280,6 +12427,231 @@
         <w:t xml:space="preserve">}</w:t>
       </w:r>
     </w:p>
+    <w:p/>
+    <w:p>
+      <w:r>
+        <w:rPr>
+          <w:rFonts w:ascii="Courier New" w:cs="Courier New" w:eastAsia="Courier New" w:hAnsi="Courier New"/>
+          <w:color w:val="0D2B4E"/>
+          <w:sz w:val="17"/>
+          <w:szCs w:val="17"/>
+        </w:rPr>
+        <w:t xml:space="preserve">4.2.9 macro_context Block (NEW)</w:t>
+      </w:r>
+    </w:p>
+    <w:p/>
+    <w:p>
+      <w:r>
+        <w:rPr>
+          <w:rFonts w:ascii="Courier New" w:cs="Courier New" w:eastAsia="Courier New" w:hAnsi="Courier New"/>
+          <w:color w:val="0D2B4E"/>
+          <w:sz w:val="17"/>
+          <w:szCs w:val="17"/>
+        </w:rPr>
+        <w:t xml:space="preserve">Loaded from shared/macro-context.json (file) or a single-row macro_context Supabase table. Same for all stocks. Updated monthly by the user (takes ~5 minutes). Injected into the AI prompt as system-level context so analysis is time-aware.</w:t>
+      </w:r>
+    </w:p>
+    <w:p/>
+    <w:p>
+      <w:r>
+        <w:rPr>
+          <w:rFonts w:ascii="Courier New" w:cs="Courier New" w:eastAsia="Courier New" w:hAnsi="Courier New"/>
+          <w:color w:val="0D2B4E"/>
+          <w:sz w:val="17"/>
+          <w:szCs w:val="17"/>
+        </w:rPr>
+        <w:t xml:space="preserve">"macro_context": {</w:t>
+      </w:r>
+    </w:p>
+    <w:p>
+      <w:r>
+        <w:rPr>
+          <w:rFonts w:ascii="Courier New" w:cs="Courier New" w:eastAsia="Courier New" w:hAnsi="Courier New"/>
+          <w:color w:val="0D2B4E"/>
+          <w:sz w:val="17"/>
+          <w:szCs w:val="17"/>
+        </w:rPr>
+        <w:t xml:space="preserve">  "as_of":                "2026-03",</w:t>
+      </w:r>
+    </w:p>
+    <w:p>
+      <w:r>
+        <w:rPr>
+          <w:rFonts w:ascii="Courier New" w:cs="Courier New" w:eastAsia="Courier New" w:hAnsi="Courier New"/>
+          <w:color w:val="0D2B4E"/>
+          <w:sz w:val="17"/>
+          <w:szCs w:val="17"/>
+        </w:rPr>
+        <w:t xml:space="preserve">  "bi_rate":              5.75,</w:t>
+      </w:r>
+    </w:p>
+    <w:p>
+      <w:r>
+        <w:rPr>
+          <w:rFonts w:ascii="Courier New" w:cs="Courier New" w:eastAsia="Courier New" w:hAnsi="Courier New"/>
+          <w:color w:val="0D2B4E"/>
+          <w:sz w:val="17"/>
+          <w:szCs w:val="17"/>
+        </w:rPr>
+        <w:t xml:space="preserve">  "bi_rate_direction":    "easing_expected",</w:t>
+      </w:r>
+    </w:p>
+    <w:p>
+      <w:r>
+        <w:rPr>
+          <w:rFonts w:ascii="Courier New" w:cs="Courier New" w:eastAsia="Courier New" w:hAnsi="Courier New"/>
+          <w:color w:val="0D2B4E"/>
+          <w:sz w:val="17"/>
+          <w:szCs w:val="17"/>
+        </w:rPr>
+        <w:t xml:space="preserve">  "usd_idr":             16200,</w:t>
+      </w:r>
+    </w:p>
+    <w:p>
+      <w:r>
+        <w:rPr>
+          <w:rFonts w:ascii="Courier New" w:cs="Courier New" w:eastAsia="Courier New" w:hAnsi="Courier New"/>
+          <w:color w:val="0D2B4E"/>
+          <w:sz w:val="17"/>
+          <w:szCs w:val="17"/>
+        </w:rPr>
+        <w:t xml:space="preserve">  "idr_trend":           "weakening",</w:t>
+      </w:r>
+    </w:p>
+    <w:p>
+      <w:r>
+        <w:rPr>
+          <w:rFonts w:ascii="Courier New" w:cs="Courier New" w:eastAsia="Courier New" w:hAnsi="Courier New"/>
+          <w:color w:val="0D2B4E"/>
+          <w:sz w:val="17"/>
+          <w:szCs w:val="17"/>
+        </w:rPr>
+        <w:t xml:space="preserve">  "idx_composite_ytd":   -3.2,</w:t>
+      </w:r>
+    </w:p>
+    <w:p>
+      <w:r>
+        <w:rPr>
+          <w:rFonts w:ascii="Courier New" w:cs="Courier New" w:eastAsia="Courier New" w:hAnsi="Courier New"/>
+          <w:color w:val="0D2B4E"/>
+          <w:sz w:val="17"/>
+          <w:szCs w:val="17"/>
+        </w:rPr>
+        <w:t xml:space="preserve">  "foreign_flow_regime": "net_outflow",</w:t>
+      </w:r>
+    </w:p>
+    <w:p>
+      <w:r>
+        <w:rPr>
+          <w:rFonts w:ascii="Courier New" w:cs="Courier New" w:eastAsia="Courier New" w:hAnsi="Courier New"/>
+          <w:color w:val="0D2B4E"/>
+          <w:sz w:val="17"/>
+          <w:szCs w:val="17"/>
+        </w:rPr>
+        <w:t xml:space="preserve">  "foreign_flow_note":   "Broad EM de-risking driven by Fed policy, not IDX-specific.",</w:t>
+      </w:r>
+    </w:p>
+    <w:p>
+      <w:r>
+        <w:rPr>
+          <w:rFonts w:ascii="Courier New" w:cs="Courier New" w:eastAsia="Courier New" w:hAnsi="Courier New"/>
+          <w:color w:val="0D2B4E"/>
+          <w:sz w:val="17"/>
+          <w:szCs w:val="17"/>
+        </w:rPr>
+        <w:t xml:space="preserve">  "key_events": [</w:t>
+      </w:r>
+    </w:p>
+    <w:p>
+      <w:r>
+        <w:rPr>
+          <w:rFonts w:ascii="Courier New" w:cs="Courier New" w:eastAsia="Courier New" w:hAnsi="Courier New"/>
+          <w:color w:val="0D2B4E"/>
+          <w:sz w:val="17"/>
+          <w:szCs w:val="17"/>
+        </w:rPr>
+        <w:t xml:space="preserve">    "BI rate decision April 15 — market expects hold",</w:t>
+      </w:r>
+    </w:p>
+    <w:p>
+      <w:r>
+        <w:rPr>
+          <w:rFonts w:ascii="Courier New" w:cs="Courier New" w:eastAsia="Courier New" w:hAnsi="Courier New"/>
+          <w:color w:val="0D2B4E"/>
+          <w:sz w:val="17"/>
+          <w:szCs w:val="17"/>
+        </w:rPr>
+        <w:t xml:space="preserve">    "Q1 2026 earnings season starts mid-April"</w:t>
+      </w:r>
+    </w:p>
+    <w:p>
+      <w:r>
+        <w:rPr>
+          <w:rFonts w:ascii="Courier New" w:cs="Courier New" w:eastAsia="Courier New" w:hAnsi="Courier New"/>
+          <w:color w:val="0D2B4E"/>
+          <w:sz w:val="17"/>
+          <w:szCs w:val="17"/>
+        </w:rPr>
+        <w:t xml:space="preserve">  ]</w:t>
+      </w:r>
+    </w:p>
+    <w:p>
+      <w:r>
+        <w:rPr>
+          <w:rFonts w:ascii="Courier New" w:cs="Courier New" w:eastAsia="Courier New" w:hAnsi="Courier New"/>
+          <w:color w:val="0D2B4E"/>
+          <w:sz w:val="17"/>
+          <w:szCs w:val="17"/>
+        </w:rPr>
+        <w:t xml:space="preserve">}</w:t>
+      </w:r>
+    </w:p>
+    <w:p/>
+    <w:p>
+      <w:r>
+        <w:rPr>
+          <w:rFonts w:ascii="Courier New" w:cs="Courier New" w:eastAsia="Courier New" w:hAnsi="Courier New"/>
+          <w:color w:val="0D2B4E"/>
+          <w:sz w:val="17"/>
+          <w:szCs w:val="17"/>
+        </w:rPr>
+        <w:t xml:space="preserve">Storage options (choose one at implementation time):</w:t>
+      </w:r>
+    </w:p>
+    <w:p>
+      <w:r>
+        <w:rPr>
+          <w:rFonts w:ascii="Courier New" w:cs="Courier New" w:eastAsia="Courier New" w:hAnsi="Courier New"/>
+          <w:color w:val="0D2B4E"/>
+          <w:sz w:val="17"/>
+          <w:szCs w:val="17"/>
+        </w:rPr>
+        <w:t xml:space="preserve">  Option A: shared/macro-context.json file — loaded at context build time. Simple, version-controlled.</w:t>
+      </w:r>
+    </w:p>
+    <w:p>
+      <w:r>
+        <w:rPr>
+          <w:rFonts w:ascii="Courier New" w:cs="Courier New" w:eastAsia="Courier New" w:hAnsi="Courier New"/>
+          <w:color w:val="0D2B4E"/>
+          <w:sz w:val="17"/>
+          <w:szCs w:val="17"/>
+        </w:rPr>
+        <w:t xml:space="preserve">  Option B: macro_context Supabase table (single row) — editable via Pipeline Debug Panel (Section 8.5).</w:t>
+      </w:r>
+    </w:p>
+    <w:p>
+      <w:r>
+        <w:rPr>
+          <w:rFonts w:ascii="Courier New" w:cs="Courier New" w:eastAsia="Courier New" w:hAnsi="Courier New"/>
+          <w:color w:val="0D2B4E"/>
+          <w:sz w:val="17"/>
+          <w:szCs w:val="17"/>
+        </w:rPr>
+        <w:t xml:space="preserve">  Recommendation: start with JSON file, migrate to DB table when Pipeline Debug Panel is implemented.</w:t>
+      </w:r>
+    </w:p>
+    <w:p/>
     <w:p>
       <w:r>
         <w:br w:type="page"/>
@@ -15054,12 +15426,6 @@
         <w:ind w:left="280"/>
       </w:pPr>
       <w:r>
-        <w:rPr>
-          <w:rFonts w:ascii="Courier New" w:cs="Courier New" w:eastAsia="Courier New" w:hAnsi="Courier New"/>
-          <w:color w:val="0D2B4E"/>
-          <w:sz w:val="17"/>
-          <w:szCs w:val="17"/>
-        </w:rPr>
         <w:t xml:space="preserve">  ticker                TEXT PRIMARY KEY REFERENCES stocks(ticker) ON DELETE CASCADE,</w:t>
       </w:r>
     </w:p>
@@ -15070,332 +15436,186 @@
         <w:ind w:left="280"/>
       </w:pPr>
       <w:r>
-        <w:rPr>
-          <w:rFonts w:ascii="Courier New" w:cs="Courier New" w:eastAsia="Courier New" w:hAnsi="Courier New"/>
-          <w:color w:val="0D2B4E"/>
-          <w:sz w:val="17"/>
-          <w:szCs w:val="17"/>
-        </w:rPr>
-        <w:t xml:space="preserve">  -- Scores</w:t>
-      </w:r>
-    </w:p>
-    <w:p>
-      <w:pPr>
-        <w:shd w:fill="F2F6FC" w:val="clear"/>
-        <w:spacing w:before="0" w:after="0"/>
-        <w:ind w:left="280"/>
-      </w:pPr>
-      <w:r>
-        <w:rPr>
-          <w:rFonts w:ascii="Courier New" w:cs="Courier New" w:eastAsia="Courier New" w:hAnsi="Courier New"/>
-          <w:color w:val="0D2B4E"/>
-          <w:sz w:val="17"/>
-          <w:szCs w:val="17"/>
-        </w:rPr>
-        <w:t xml:space="preserve">  business_quality_score   DECIMAL(4,1),  -- 1-10</w:t>
-      </w:r>
-    </w:p>
-    <w:p>
-      <w:pPr>
-        <w:shd w:fill="F2F6FC" w:val="clear"/>
-        <w:spacing w:before="0" w:after="0"/>
-        <w:ind w:left="280"/>
-      </w:pPr>
-      <w:r>
-        <w:rPr>
-          <w:rFonts w:ascii="Courier New" w:cs="Courier New" w:eastAsia="Courier New" w:hAnsi="Courier New"/>
-          <w:color w:val="0D2B4E"/>
-          <w:sz w:val="17"/>
-          <w:szCs w:val="17"/>
-        </w:rPr>
-        <w:t xml:space="preserve">  financial_health_signal  TEXT,          -- improving|stable|deteriorating</w:t>
-      </w:r>
-    </w:p>
-    <w:p>
-      <w:pPr>
-        <w:shd w:fill="F2F6FC" w:val="clear"/>
-        <w:spacing w:before="0" w:after="0"/>
-        <w:ind w:left="280"/>
-      </w:pPr>
-      <w:r>
-        <w:rPr>
-          <w:rFonts w:ascii="Courier New" w:cs="Courier New" w:eastAsia="Courier New" w:hAnsi="Courier New"/>
-          <w:color w:val="0D2B4E"/>
-          <w:sz w:val="17"/>
-          <w:szCs w:val="17"/>
-        </w:rPr>
-        <w:t xml:space="preserve">  valuation_verdict        TEXT,          -- cheap|fair|expensive</w:t>
-      </w:r>
-    </w:p>
-    <w:p>
-      <w:pPr>
-        <w:shd w:fill="F2F6FC" w:val="clear"/>
-        <w:spacing w:before="0" w:after="0"/>
-        <w:ind w:left="280"/>
-      </w:pPr>
-      <w:r>
-        <w:rPr>
-          <w:rFonts w:ascii="Courier New" w:cs="Courier New" w:eastAsia="Courier New" w:hAnsi="Courier New"/>
-          <w:color w:val="0D2B4E"/>
-          <w:sz w:val="17"/>
-          <w:szCs w:val="17"/>
-        </w:rPr>
-        <w:t xml:space="preserve">  analyst_verdict          TEXT,          -- strong_buy|buy|hold|avoid|strong_avoid</w:t>
-      </w:r>
-    </w:p>
-    <w:p>
-      <w:pPr>
-        <w:shd w:fill="F2F6FC" w:val="clear"/>
-        <w:spacing w:before="0" w:after="0"/>
-        <w:ind w:left="280"/>
-      </w:pPr>
-      <w:r>
-        <w:rPr>
-          <w:rFonts w:ascii="Courier New" w:cs="Courier New" w:eastAsia="Courier New" w:hAnsi="Courier New"/>
-          <w:color w:val="0D2B4E"/>
-          <w:sz w:val="17"/>
-          <w:szCs w:val="17"/>
-        </w:rPr>
-        <w:t xml:space="preserve">  confidence_level         SMALLINT,      -- 1-10 (AI self-reported confidence)</w:t>
-      </w:r>
-    </w:p>
-    <w:p>
-      <w:pPr>
-        <w:shd w:fill="F2F6FC" w:val="clear"/>
-        <w:spacing w:before="0" w:after="0"/>
-        <w:ind w:left="280"/>
-      </w:pPr>
-      <w:r>
-        <w:rPr>
-          <w:rFonts w:ascii="Courier New" w:cs="Courier New" w:eastAsia="Courier New" w:hAnsi="Courier New"/>
-          <w:color w:val="0D2B4E"/>
-          <w:sz w:val="17"/>
-          <w:szCs w:val="17"/>
-        </w:rPr>
-        <w:t xml:space="preserve">  -- Thesis</w:t>
-      </w:r>
-    </w:p>
-    <w:p>
-      <w:pPr>
-        <w:shd w:fill="F2F6FC" w:val="clear"/>
-        <w:spacing w:before="0" w:after="0"/>
-        <w:ind w:left="280"/>
-      </w:pPr>
-      <w:r>
-        <w:rPr>
-          <w:rFonts w:ascii="Courier New" w:cs="Courier New" w:eastAsia="Courier New" w:hAnsi="Courier New"/>
-          <w:color w:val="0D2B4E"/>
-          <w:sz w:val="17"/>
-          <w:szCs w:val="17"/>
-        </w:rPr>
-        <w:t xml:space="preserve">  business_quality_rationale  TEXT,       -- 2-3 sentences</w:t>
-      </w:r>
-    </w:p>
-    <w:p>
-      <w:pPr>
-        <w:shd w:fill="F2F6FC" w:val="clear"/>
-        <w:spacing w:before="0" w:after="0"/>
-        <w:ind w:left="280"/>
-      </w:pPr>
-      <w:r>
-        <w:rPr>
-          <w:rFonts w:ascii="Courier New" w:cs="Courier New" w:eastAsia="Courier New" w:hAnsi="Courier New"/>
-          <w:color w:val="0D2B4E"/>
-          <w:sz w:val="17"/>
-          <w:szCs w:val="17"/>
-        </w:rPr>
-        <w:t xml:space="preserve">  key_financial_insights      TEXT,       -- JSON array of 3 insight strings</w:t>
-      </w:r>
-    </w:p>
-    <w:p>
-      <w:pPr>
-        <w:shd w:fill="F2F6FC" w:val="clear"/>
-        <w:spacing w:before="0" w:after="0"/>
-        <w:ind w:left="280"/>
-      </w:pPr>
-      <w:r>
-        <w:rPr>
-          <w:rFonts w:ascii="Courier New" w:cs="Courier New" w:eastAsia="Courier New" w:hAnsi="Courier New"/>
-          <w:color w:val="0D2B4E"/>
-          <w:sz w:val="17"/>
-          <w:szCs w:val="17"/>
-        </w:rPr>
-        <w:t xml:space="preserve">  bull_case                   TEXT,       -- 2-3 sentences</w:t>
-      </w:r>
-    </w:p>
-    <w:p>
-      <w:pPr>
-        <w:shd w:fill="F2F6FC" w:val="clear"/>
-        <w:spacing w:before="0" w:after="0"/>
-        <w:ind w:left="280"/>
-      </w:pPr>
-      <w:r>
-        <w:rPr>
-          <w:rFonts w:ascii="Courier New" w:cs="Courier New" w:eastAsia="Courier New" w:hAnsi="Courier New"/>
-          <w:color w:val="0D2B4E"/>
-          <w:sz w:val="17"/>
-          <w:szCs w:val="17"/>
-        </w:rPr>
-        <w:t xml:space="preserve">  bear_case                   TEXT,       -- 2-3 sentences</w:t>
-      </w:r>
-    </w:p>
-    <w:p>
-      <w:pPr>
-        <w:shd w:fill="F2F6FC" w:val="clear"/>
-        <w:spacing w:before="0" w:after="0"/>
-        <w:ind w:left="280"/>
-      </w:pPr>
-      <w:r>
-        <w:rPr>
-          <w:rFonts w:ascii="Courier New" w:cs="Courier New" w:eastAsia="Courier New" w:hAnsi="Courier New"/>
-          <w:color w:val="0D2B4E"/>
-          <w:sz w:val="17"/>
-          <w:szCs w:val="17"/>
-        </w:rPr>
-        <w:t xml:space="preserve">  key_risks                   TEXT,       -- JSON array of 3 risk strings</w:t>
-      </w:r>
-    </w:p>
-    <w:p>
-      <w:pPr>
-        <w:shd w:fill="F2F6FC" w:val="clear"/>
-        <w:spacing w:before="0" w:after="0"/>
-        <w:ind w:left="280"/>
-      </w:pPr>
-      <w:r>
-        <w:rPr>
-          <w:rFonts w:ascii="Courier New" w:cs="Courier New" w:eastAsia="Courier New" w:hAnsi="Courier New"/>
-          <w:color w:val="0D2B4E"/>
-          <w:sz w:val="17"/>
-          <w:szCs w:val="17"/>
-        </w:rPr>
-        <w:t xml:space="preserve">  -- Valuation</w:t>
-      </w:r>
-    </w:p>
-    <w:p>
-      <w:pPr>
-        <w:shd w:fill="F2F6FC" w:val="clear"/>
-        <w:spacing w:before="0" w:after="0"/>
-        <w:ind w:left="280"/>
-      </w:pPr>
-      <w:r>
-        <w:rPr>
-          <w:rFonts w:ascii="Courier New" w:cs="Courier New" w:eastAsia="Courier New" w:hAnsi="Courier New"/>
-          <w:color w:val="0D2B4E"/>
-          <w:sz w:val="17"/>
-          <w:szCs w:val="17"/>
-        </w:rPr>
-        <w:t xml:space="preserve">  margin_of_safety            DECIMAL(8,4),</w:t>
-      </w:r>
-    </w:p>
-    <w:p>
-      <w:pPr>
-        <w:shd w:fill="F2F6FC" w:val="clear"/>
-        <w:spacing w:before="0" w:after="0"/>
-        <w:ind w:left="280"/>
-      </w:pPr>
-      <w:r>
-        <w:rPr>
-          <w:rFonts w:ascii="Courier New" w:cs="Courier New" w:eastAsia="Courier New" w:hAnsi="Courier New"/>
-          <w:color w:val="0D2B4E"/>
-          <w:sz w:val="17"/>
-          <w:szCs w:val="17"/>
-        </w:rPr>
-        <w:t xml:space="preserve">  entry_price_low             BIGINT,</w:t>
-      </w:r>
-    </w:p>
-    <w:p>
-      <w:pPr>
-        <w:shd w:fill="F2F6FC" w:val="clear"/>
-        <w:spacing w:before="0" w:after="0"/>
-        <w:ind w:left="280"/>
-      </w:pPr>
-      <w:r>
-        <w:rPr>
-          <w:rFonts w:ascii="Courier New" w:cs="Courier New" w:eastAsia="Courier New" w:hAnsi="Courier New"/>
-          <w:color w:val="0D2B4E"/>
-          <w:sz w:val="17"/>
-          <w:szCs w:val="17"/>
-        </w:rPr>
-        <w:t xml:space="preserve">  entry_price_high            BIGINT,</w:t>
-      </w:r>
-    </w:p>
-    <w:p>
-      <w:pPr>
-        <w:shd w:fill="F2F6FC" w:val="clear"/>
-        <w:spacing w:before="0" w:after="0"/>
-        <w:ind w:left="280"/>
-      </w:pPr>
-      <w:r>
-        <w:rPr>
-          <w:rFonts w:ascii="Courier New" w:cs="Courier New" w:eastAsia="Courier New" w:hAnsi="Courier New"/>
-          <w:color w:val="0D2B4E"/>
-          <w:sz w:val="17"/>
-          <w:szCs w:val="17"/>
-        </w:rPr>
-        <w:t xml:space="preserve">  target_price_12m            BIGINT,</w:t>
-      </w:r>
-    </w:p>
-    <w:p>
-      <w:pPr>
-        <w:shd w:fill="F2F6FC" w:val="clear"/>
-        <w:spacing w:before="0" w:after="0"/>
-        <w:ind w:left="280"/>
-      </w:pPr>
-      <w:r>
-        <w:rPr>
-          <w:rFonts w:ascii="Courier New" w:cs="Courier New" w:eastAsia="Courier New" w:hAnsi="Courier New"/>
-          <w:color w:val="0D2B4E"/>
-          <w:sz w:val="17"/>
-          <w:szCs w:val="17"/>
-        </w:rPr>
-        <w:t xml:space="preserve">  -- Data quality acknowledgement</w:t>
-      </w:r>
-    </w:p>
-    <w:p>
-      <w:pPr>
-        <w:shd w:fill="F2F6FC" w:val="clear"/>
-        <w:spacing w:before="0" w:after="0"/>
-        <w:ind w:left="280"/>
-      </w:pPr>
-      <w:r>
-        <w:rPr>
-          <w:rFonts w:ascii="Courier New" w:cs="Courier New" w:eastAsia="Courier New" w:hAnsi="Courier New"/>
-          <w:color w:val="0D2B4E"/>
-          <w:sz w:val="17"/>
-          <w:szCs w:val="17"/>
-        </w:rPr>
-        <w:t xml:space="preserve">  data_gaps_acknowledged      TEXT,       -- JSON array: AI acknowledges gaps</w:t>
-      </w:r>
-    </w:p>
-    <w:p>
-      <w:pPr>
-        <w:shd w:fill="F2F6FC" w:val="clear"/>
-        <w:spacing w:before="0" w:after="0"/>
-        <w:ind w:left="280"/>
-      </w:pPr>
-      <w:r>
-        <w:rPr>
-          <w:rFonts w:ascii="Courier New" w:cs="Courier New" w:eastAsia="Courier New" w:hAnsi="Courier New"/>
-          <w:color w:val="0D2B4E"/>
-          <w:sz w:val="17"/>
-          <w:szCs w:val="17"/>
-        </w:rPr>
-        <w:t xml:space="preserve">  caveats                     TEXT,       -- JSON array: AI-stated caveats</w:t>
-      </w:r>
-    </w:p>
-    <w:p>
-      <w:pPr>
-        <w:shd w:fill="F2F6FC" w:val="clear"/>
-        <w:spacing w:before="0" w:after="0"/>
-        <w:ind w:left="280"/>
-      </w:pPr>
-      <w:r>
-        <w:rPr>
-          <w:rFonts w:ascii="Courier New" w:cs="Courier New" w:eastAsia="Courier New" w:hAnsi="Courier New"/>
-          <w:color w:val="0D2B4E"/>
-          <w:sz w:val="17"/>
-          <w:szCs w:val="17"/>
-        </w:rPr>
+        <w:t xml:space="preserve">  -- Classification</w:t>
+      </w:r>
+    </w:p>
+    <w:p>
+      <w:pPr>
+        <w:shd w:fill="F2F6FC" w:val="clear"/>
+        <w:spacing w:before="0" w:after="0"/>
+        <w:ind w:left="280"/>
+      </w:pPr>
+      <w:r>
+        <w:t xml:space="preserve">  lynch_category           TEXT,          -- slow_grower|stalwart|fast_grower|cyclical|turnaround|asset_play</w:t>
+      </w:r>
+    </w:p>
+    <w:p>
+      <w:pPr>
+        <w:shd w:fill="F2F6FC" w:val="clear"/>
+        <w:spacing w:before="0" w:after="0"/>
+        <w:ind w:left="280"/>
+      </w:pPr>
+      <w:r>
+        <w:t xml:space="preserve">  lynch_rationale           TEXT,</w:t>
+      </w:r>
+    </w:p>
+    <w:p>
+      <w:pPr>
+        <w:shd w:fill="F2F6FC" w:val="clear"/>
+        <w:spacing w:before="0" w:after="0"/>
+        <w:ind w:left="280"/>
+      </w:pPr>
+      <w:r>
+        <w:t xml:space="preserve">  buffett_moat              TEXT,          -- none|narrow|wide</w:t>
+      </w:r>
+    </w:p>
+    <w:p>
+      <w:pPr>
+        <w:shd w:fill="F2F6FC" w:val="clear"/>
+        <w:spacing w:before="0" w:after="0"/>
+        <w:ind w:left="280"/>
+      </w:pPr>
+      <w:r>
+        <w:t xml:space="preserve">  buffett_moat_source       TEXT,</w:t>
+      </w:r>
+    </w:p>
+    <w:p>
+      <w:pPr>
+        <w:shd w:fill="F2F6FC" w:val="clear"/>
+        <w:spacing w:before="0" w:after="0"/>
+        <w:ind w:left="280"/>
+      </w:pPr>
+      <w:r>
+        <w:t xml:space="preserve">  business_narrative         TEXT,          -- 3-4 sentence business story</w:t>
+      </w:r>
+    </w:p>
+    <w:p>
+      <w:pPr>
+        <w:shd w:fill="F2F6FC" w:val="clear"/>
+        <w:spacing w:before="0" w:after="0"/>
+        <w:ind w:left="280"/>
+      </w:pPr>
+      <w:r>
+        <w:t xml:space="preserve">  financial_health_signal    TEXT,          -- improving|stable|deteriorating</w:t>
+      </w:r>
+    </w:p>
+    <w:p>
+      <w:pPr>
+        <w:shd w:fill="F2F6FC" w:val="clear"/>
+        <w:spacing w:before="0" w:after="0"/>
+        <w:ind w:left="280"/>
+      </w:pPr>
+      <w:r>
+        <w:t xml:space="preserve">  -- Three scenarios (stored as JSONB)</w:t>
+      </w:r>
+    </w:p>
+    <w:p>
+      <w:pPr>
+        <w:shd w:fill="F2F6FC" w:val="clear"/>
+        <w:spacing w:before="0" w:after="0"/>
+        <w:ind w:left="280"/>
+      </w:pPr>
+      <w:r>
+        <w:t xml:space="preserve">  bull_case                  JSONB,        -- {scenario, drivers[], price_target, timeframe, probability, early_signs[]}</w:t>
+      </w:r>
+    </w:p>
+    <w:p>
+      <w:pPr>
+        <w:shd w:fill="F2F6FC" w:val="clear"/>
+        <w:spacing w:before="0" w:after="0"/>
+        <w:ind w:left="280"/>
+      </w:pPr>
+      <w:r>
+        <w:t xml:space="preserve">  bear_case                  JSONB,        -- same structure</w:t>
+      </w:r>
+    </w:p>
+    <w:p>
+      <w:pPr>
+        <w:shd w:fill="F2F6FC" w:val="clear"/>
+        <w:spacing w:before="0" w:after="0"/>
+        <w:ind w:left="280"/>
+      </w:pPr>
+      <w:r>
+        <w:t xml:space="preserve">  neutral_case               JSONB,        -- {scenario, drivers[], price_range_low, price_range_high, probability, what_breaks_it[]}</w:t>
+      </w:r>
+    </w:p>
+    <w:p>
+      <w:pPr>
+        <w:shd w:fill="F2F6FC" w:val="clear"/>
+        <w:spacing w:before="0" w:after="0"/>
+        <w:ind w:left="280"/>
+      </w:pPr>
+      <w:r>
+        <w:t xml:space="preserve">  -- Strategy</w:t>
+      </w:r>
+    </w:p>
+    <w:p>
+      <w:pPr>
+        <w:shd w:fill="F2F6FC" w:val="clear"/>
+        <w:spacing w:before="0" w:after="0"/>
+        <w:ind w:left="280"/>
+      </w:pPr>
+      <w:r>
+        <w:t xml:space="preserve">  strategy_fit               JSONB,        -- {primary, ideal_investor, position_sizing}</w:t>
+      </w:r>
+    </w:p>
+    <w:p>
+      <w:pPr>
+        <w:shd w:fill="F2F6FC" w:val="clear"/>
+        <w:spacing w:before="0" w:after="0"/>
+        <w:ind w:left="280"/>
+      </w:pPr>
+      <w:r>
+        <w:t xml:space="preserve">  what_to_watch              TEXT,          -- JSON array of metric+threshold strings</w:t>
+      </w:r>
+    </w:p>
+    <w:p>
+      <w:pPr>
+        <w:shd w:fill="F2F6FC" w:val="clear"/>
+        <w:spacing w:before="0" w:after="0"/>
+        <w:ind w:left="280"/>
+      </w:pPr>
+      <w:r>
+        <w:t xml:space="preserve">  analyst_verdict            TEXT,          -- strong_buy|buy|hold|avoid|strong_avoid</w:t>
+      </w:r>
+    </w:p>
+    <w:p>
+      <w:pPr>
+        <w:shd w:fill="F2F6FC" w:val="clear"/>
+        <w:spacing w:before="0" w:after="0"/>
+        <w:ind w:left="280"/>
+      </w:pPr>
+      <w:r>
+        <w:t xml:space="preserve">  confidence_level           SMALLINT,     -- 1-10</w:t>
+      </w:r>
+    </w:p>
+    <w:p>
+      <w:pPr>
+        <w:shd w:fill="F2F6FC" w:val="clear"/>
+        <w:spacing w:before="0" w:after="0"/>
+        <w:ind w:left="280"/>
+      </w:pPr>
+      <w:r>
+        <w:t xml:space="preserve">  data_gaps_acknowledged     TEXT,          -- JSON array</w:t>
+      </w:r>
+    </w:p>
+    <w:p>
+      <w:pPr>
+        <w:shd w:fill="F2F6FC" w:val="clear"/>
+        <w:spacing w:before="0" w:after="0"/>
+        <w:ind w:left="280"/>
+      </w:pPr>
+      <w:r>
+        <w:t xml:space="preserve">  caveats                    TEXT,          -- JSON array</w:t>
+      </w:r>
+    </w:p>
+    <w:p>
+      <w:pPr>
+        <w:shd w:fill="F2F6FC" w:val="clear"/>
+        <w:spacing w:before="0" w:after="0"/>
+        <w:ind w:left="280"/>
+      </w:pPr>
+      <w:r>
         <w:t xml:space="preserve">  -- Metadata</w:t>
       </w:r>
     </w:p>
@@ -15406,79 +15626,140 @@
         <w:ind w:left="280"/>
       </w:pPr>
       <w:r>
-        <w:rPr>
-          <w:rFonts w:ascii="Courier New" w:cs="Courier New" w:eastAsia="Courier New" w:hAnsi="Courier New"/>
-          <w:color w:val="0D2B4E"/>
-          <w:sz w:val="17"/>
-          <w:szCs w:val="17"/>
-        </w:rPr>
-        <w:t xml:space="preserve">  model_used                  TEXT DEFAULT 'claude-sonnet-4-20250514',</w:t>
-      </w:r>
-    </w:p>
-    <w:p>
-      <w:pPr>
-        <w:shd w:fill="F2F6FC" w:val="clear"/>
-        <w:spacing w:before="0" w:after="0"/>
-        <w:ind w:left="280"/>
-      </w:pPr>
-      <w:r>
-        <w:rPr>
-          <w:rFonts w:ascii="Courier New" w:cs="Courier New" w:eastAsia="Courier New" w:hAnsi="Courier New"/>
-          <w:color w:val="0D2B4E"/>
-          <w:sz w:val="17"/>
-          <w:szCs w:val="17"/>
-        </w:rPr>
-        <w:t xml:space="preserve">  context_version             TEXT,       -- from ai_context_cache.context_version</w:t>
-      </w:r>
-    </w:p>
-    <w:p>
-      <w:pPr>
-        <w:shd w:fill="F2F6FC" w:val="clear"/>
-        <w:spacing w:before="0" w:after="0"/>
-        <w:ind w:left="280"/>
-      </w:pPr>
-      <w:r>
-        <w:rPr>
-          <w:rFonts w:ascii="Courier New" w:cs="Courier New" w:eastAsia="Courier New" w:hAnsi="Courier New"/>
-          <w:color w:val="0D2B4E"/>
-          <w:sz w:val="17"/>
-          <w:szCs w:val="17"/>
-        </w:rPr>
-        <w:t xml:space="preserve">  prompt_tokens               INTEGER,</w:t>
-      </w:r>
-    </w:p>
-    <w:p>
-      <w:pPr>
-        <w:shd w:fill="F2F6FC" w:val="clear"/>
-        <w:spacing w:before="0" w:after="0"/>
-        <w:ind w:left="280"/>
-      </w:pPr>
-      <w:r>
-        <w:rPr>
-          <w:rFonts w:ascii="Courier New" w:cs="Courier New" w:eastAsia="Courier New" w:hAnsi="Courier New"/>
-          <w:color w:val="0D2B4E"/>
-          <w:sz w:val="17"/>
-          <w:szCs w:val="17"/>
-        </w:rPr>
-        <w:t xml:space="preserve">  output_tokens               INTEGER,</w:t>
-      </w:r>
-    </w:p>
-    <w:p>
-      <w:pPr>
-        <w:shd w:fill="F2F6FC" w:val="clear"/>
-        <w:spacing w:before="0" w:after="0"/>
-        <w:ind w:left="280"/>
-      </w:pPr>
-      <w:r>
-        <w:rPr>
-          <w:rFonts w:ascii="Courier New" w:cs="Courier New" w:eastAsia="Courier New" w:hAnsi="Courier New"/>
-          <w:color w:val="0D2B4E"/>
-          <w:sz w:val="17"/>
-          <w:szCs w:val="17"/>
-        </w:rPr>
-        <w:t xml:space="preserve">  generated_at                TIMESTAMPTZ DEFAULT NOW()</w:t>
-      </w:r>
-    </w:p>
+        <w:t xml:space="preserve">  model_used                 TEXT DEFAULT 'claude-sonnet-4-20250514',</w:t>
+      </w:r>
+    </w:p>
+    <w:p>
+      <w:pPr>
+        <w:shd w:fill="F2F6FC" w:val="clear"/>
+        <w:spacing w:before="0" w:after="0"/>
+        <w:ind w:left="280"/>
+      </w:pPr>
+      <w:r>
+        <w:t xml:space="preserve">  context_version            TEXT,</w:t>
+      </w:r>
+    </w:p>
+    <w:p>
+      <w:pPr>
+        <w:shd w:fill="F2F6FC" w:val="clear"/>
+        <w:spacing w:before="0" w:after="0"/>
+        <w:ind w:left="280"/>
+      </w:pPr>
+      <w:r>
+        <w:t xml:space="preserve">  prompt_tokens              INTEGER,</w:t>
+      </w:r>
+    </w:p>
+    <w:p>
+      <w:pPr>
+        <w:shd w:fill="F2F6FC" w:val="clear"/>
+        <w:spacing w:before="0" w:after="0"/>
+        <w:ind w:left="280"/>
+      </w:pPr>
+      <w:r>
+        <w:t xml:space="preserve">  output_tokens              INTEGER,</w:t>
+      </w:r>
+    </w:p>
+    <w:p>
+      <w:pPr>
+        <w:shd w:fill="F2F6FC" w:val="clear"/>
+        <w:spacing w:before="0" w:after="0"/>
+        <w:ind w:left="280"/>
+      </w:pPr>
+      <w:r>
+        <w:t xml:space="preserve">  generated_at               TIMESTAMPTZ DEFAULT NOW()</w:t>
+      </w:r>
+    </w:p>
+    <w:p>
+      <w:pPr>
+        <w:shd w:fill="F2F6FC" w:val="clear"/>
+        <w:spacing w:before="0" w:after="0"/>
+        <w:ind w:left="280"/>
+      </w:pPr>
+      <w:r>
+        <w:t>);</w:t>
+      </w:r>
+    </w:p>
+    <w:p>
+      <w:pPr>
+        <w:shd w:fill="F2F6FC" w:val="clear"/>
+        <w:spacing w:before="0" w:after="0"/>
+        <w:ind w:left="280"/>
+      </w:pPr>
+      <w:r/>
+    </w:p>
+    <w:p/>
+    <w:p>
+      <w:r>
+        <w:rPr>
+          <w:rFonts w:ascii="Arial" w:cs="Arial" w:eastAsia="Arial" w:hAnsi="Arial"/>
+          <w:sz w:val="20"/>
+          <w:szCs w:val="20"/>
+        </w:rPr>
+        <w:t xml:space="preserve">New Table: stock_notes (Layer 3 domain context, optional per ticker)</w:t>
+      </w:r>
+    </w:p>
+    <w:p>
+      <w:r>
+        <w:rPr>
+          <w:rFonts w:ascii="Arial" w:cs="Arial" w:eastAsia="Arial" w:hAnsi="Arial"/>
+          <w:sz w:val="20"/>
+          <w:szCs w:val="20"/>
+        </w:rPr>
+        <w:t xml:space="preserve">CREATE TABLE stock_notes (</w:t>
+      </w:r>
+    </w:p>
+    <w:p>
+      <w:r>
+        <w:rPr>
+          <w:rFonts w:ascii="Arial" w:cs="Arial" w:eastAsia="Arial" w:hAnsi="Arial"/>
+          <w:sz w:val="20"/>
+          <w:szCs w:val="20"/>
+        </w:rPr>
+        <w:t xml:space="preserve">  ticker        TEXT PRIMARY KEY REFERENCES stocks(ticker) ON DELETE CASCADE,</w:t>
+      </w:r>
+    </w:p>
+    <w:p>
+      <w:r>
+        <w:rPr>
+          <w:rFonts w:ascii="Arial" w:cs="Arial" w:eastAsia="Arial" w:hAnsi="Arial"/>
+          <w:sz w:val="20"/>
+          <w:szCs w:val="20"/>
+        </w:rPr>
+        <w:t xml:space="preserve">  domain_notes  TEXT,            -- 2-5 sentences of business context (user-written)</w:t>
+      </w:r>
+    </w:p>
+    <w:p>
+      <w:r>
+        <w:rPr>
+          <w:rFonts w:ascii="Arial" w:cs="Arial" w:eastAsia="Arial" w:hAnsi="Arial"/>
+          <w:sz w:val="20"/>
+          <w:szCs w:val="20"/>
+        </w:rPr>
+        <w:t xml:space="preserve">  updated_at    TIMESTAMPTZ DEFAULT NOW()</w:t>
+      </w:r>
+    </w:p>
+    <w:p>
+      <w:r>
+        <w:rPr>
+          <w:rFonts w:ascii="Arial" w:cs="Arial" w:eastAsia="Arial" w:hAnsi="Arial"/>
+          <w:sz w:val="20"/>
+          <w:szCs w:val="20"/>
+        </w:rPr>
+        <w:t xml:space="preserve">);</w:t>
+      </w:r>
+    </w:p>
+    <w:p/>
+    <w:p>
+      <w:r>
+        <w:rPr>
+          <w:rFonts w:ascii="Arial" w:cs="Arial" w:eastAsia="Arial" w:hAnsi="Arial"/>
+          <w:sz w:val="20"/>
+          <w:szCs w:val="20"/>
+        </w:rPr>
+        <w:t xml:space="preserve">When domain_notes is present for a ticker, context_builder.py injects it into the AI prompt. When absent, the AI works with the data bundle + macro context + sector template only and flags conclusions that would benefit from deeper company-specific knowledge.</w:t>
+      </w:r>
+    </w:p>
+    <w:p/>
     <w:p>
       <w:pPr>
         <w:shd w:fill="F2F6FC" w:val="clear"/>
@@ -15506,15 +15787,29 @@
         <w:spacing w:before="300" w:after="120"/>
       </w:pPr>
       <w:r>
-        <w:rPr>
-          <w:rFonts w:ascii="Arial" w:cs="Arial" w:eastAsia="Arial" w:hAnsi="Arial"/>
-          <w:b/>
-          <w:bCs/>
-          <w:color w:val="0A4D3C"/>
-          <w:sz w:val="28"/>
-          <w:szCs w:val="28"/>
-        </w:rPr>
-        <w:t xml:space="preserve">6.2 Multi-Step Reasoning Chain</w:t>
+        <w:t>6.2 Single Enriched Call Architecture (replaces 3-call chain)</w:t>
+      </w:r>
+    </w:p>
+    <w:p/>
+    <w:p>
+      <w:r>
+        <w:rPr>
+          <w:rFonts w:ascii="Arial" w:cs="Arial" w:eastAsia="Arial" w:hAnsi="Arial"/>
+          <w:sz w:val="20"/>
+          <w:szCs w:val="20"/>
+        </w:rPr>
+        <w:t xml:space="preserve">Simulation testing confirmed that the original 3-call chain (Bull Agent -&gt; Bear Agent -&gt; Synthesis Agent) produced data summaries, not investment insight. The AI restated numbers the user already sees on the dashboard. A single enriched call with domain context injection produced significantly better output: forward-looking scenarios, strategy classification, catalysts, and actionable what-to-watch metrics.</w:t>
+      </w:r>
+    </w:p>
+    <w:p/>
+    <w:p>
+      <w:r>
+        <w:t>6.3 System Prompt Architecture</w:t>
+      </w:r>
+    </w:p>
+    <w:p>
+      <w:r>
+        <w:t>Single System Prompt (enriched with 3-layer context)</w:t>
       </w:r>
     </w:p>
     <w:p>
@@ -15522,30 +15817,73 @@
         <w:spacing w:after="100"/>
       </w:pPr>
       <w:r>
-        <w:rPr>
-          <w:rFonts w:ascii="Arial" w:cs="Arial" w:eastAsia="Arial" w:hAnsi="Arial"/>
-          <w:sz w:val="20"/>
-          <w:szCs w:val="20"/>
-        </w:rPr>
-        <w:t xml:space="preserve">The AI analyst uses a </w:t>
-      </w:r>
-      <w:r>
-        <w:rPr>
-          <w:rFonts w:ascii="Arial" w:cs="Arial" w:eastAsia="Arial" w:hAnsi="Arial"/>
-          <w:b/>
-          <w:bCs/>
-          <w:sz w:val="20"/>
-          <w:szCs w:val="20"/>
-        </w:rPr>
-        <w:t xml:space="preserve">three-call chain per ticker</w:t>
-      </w:r>
-      <w:r>
-        <w:rPr>
-          <w:rFonts w:ascii="Arial" w:cs="Arial" w:eastAsia="Arial" w:hAnsi="Arial"/>
-          <w:sz w:val="20"/>
-          <w:szCs w:val="20"/>
-        </w:rPr>
-        <w:t xml:space="preserve"> rather than one large prompt. Each call is independent and additive. This replicates investment committee reasoning.</w:t>
+        <w:t>SYSTEM = '''</w:t>
+        <w:br/>
+        <w:t>You are a senior equity analyst for Indonesian stocks (IDX/BEI). You combine</w:t>
+        <w:br/>
+        <w:t>Warren Buffett's value investing framework and Peter Lynch's stock classification.</w:t>
+        <w:br/>
+        <w:br/>
+        <w:t>BUFFETT FRAMEWORK — assess for every stock:</w:t>
+        <w:br/>
+        <w:t>- Economic moat (none|narrow|wide): what protects profits? Is it durable?</w:t>
+        <w:br/>
+        <w:t>- Owner earnings: look past accounting — what cash can the owner actually take out?</w:t>
+        <w:br/>
+        <w:t>- Margin of safety: how much can you be wrong and still not lose money?</w:t>
+        <w:br/>
+        <w:br/>
+        <w:t>PETER LYNCH CATEGORIES — classify every stock into exactly ONE:</w:t>
+        <w:br/>
+        <w:t>- slow_grower: Large mature, 2-4% growth, buy for dividends</w:t>
+        <w:br/>
+        <w:t>- stalwart: Large quality, 10-12% growth, moderate upside, recession-resistant</w:t>
+        <w:br/>
+        <w:t>- fast_grower: Small/mid aggressive, 20%+ growth, highest upside but risky</w:t>
+        <w:br/>
+        <w:t>- cyclical: Revenue/profits follow economic or commodity cycles. Timing &gt; valuation.</w:t>
+        <w:br/>
+        <w:t>- turnaround: In crisis or recovering. Binary outcome.</w:t>
+        <w:br/>
+        <w:t>- asset_play: Valuable assets the market hasn't noticed</w:t>
+        <w:br/>
+        <w:br/>
+        <w:t>CRITICAL RULES:</w:t>
+        <w:br/>
+        <w:t>- Do NOT summarize the data. The user already sees every number on their dashboard.</w:t>
+        <w:br/>
+        <w:t>- Your job is to provide INSIGHT that the numbers alone cannot show.</w:t>
+        <w:br/>
+        <w:t>- Explain the BUSINESS STORY: what is actually happening and why.</w:t>
+        <w:br/>
+        <w:t>- Each scenario must explain: what happens, what drives it, what the stock does,</w:t>
+        <w:br/>
+        <w:t xml:space="preserve">  and the early signs that this scenario is playing out.</w:t>
+        <w:br/>
+        <w:t>- The neutral case is the MOST LIKELY path, not a blend of bull/bear.</w:t>
+        <w:br/>
+        <w:t>- If domain_notes are empty, work with data + macro + sector template.</w:t>
+        <w:br/>
+        <w:t xml:space="preserve">  Flag conclusions that would benefit from deeper company-specific knowledge.</w:t>
+        <w:br/>
+        <w:t>- data_gap_flags must be acknowledged. Say what you don't know and how it</w:t>
+        <w:br/>
+        <w:t xml:space="preserve">  would change your view.</w:t>
+        <w:br/>
+        <w:br/>
+        <w:t>IDX-specific:</w:t>
+        <w:br/>
+        <w:t>- Banking: weight NIM, CASA, NPL. Ignore current_ratio/interest_coverage.</w:t>
+        <w:br/>
+        <w:t>- BUMN: apply 15-20% structural PE discount (governance + political lending risk).</w:t>
+        <w:br/>
+        <w:t>- COVID 2020: structural anomaly, not company-specific. Do not cite as pattern.</w:t>
+        <w:br/>
+        <w:t>- Low PE on cyclicals is often a trap (Lynch rule). High yield from BUMN may be</w:t>
+        <w:br/>
+        <w:t xml:space="preserve">  government extracting cash, not shareholder-friendly policy.</w:t>
+        <w:br/>
+        <w:t>'''</w:t>
       </w:r>
     </w:p>
     <w:p>
@@ -15598,15 +15936,7 @@
               <w:spacing w:after="0"/>
             </w:pPr>
             <w:r>
-              <w:rPr>
-                <w:rFonts w:ascii="Arial" w:cs="Arial" w:eastAsia="Arial" w:hAnsi="Arial"/>
-                <w:b/>
-                <w:bCs/>
-                <w:color w:val="FFFFFF"/>
-                <w:sz w:val="19"/>
-                <w:szCs w:val="19"/>
-              </w:rPr>
-              <w:t xml:space="preserve">Call</w:t>
+              <w:t>Component</w:t>
             </w:r>
           </w:p>
         </w:tc>
@@ -15633,15 +15963,7 @@
               <w:spacing w:after="0"/>
             </w:pPr>
             <w:r>
-              <w:rPr>
-                <w:rFonts w:ascii="Arial" w:cs="Arial" w:eastAsia="Arial" w:hAnsi="Arial"/>
-                <w:b/>
-                <w:bCs/>
-                <w:color w:val="FFFFFF"/>
-                <w:sz w:val="19"/>
-                <w:szCs w:val="19"/>
-              </w:rPr>
-              <w:t xml:space="preserve">Role</w:t>
+              <w:t>Source</w:t>
             </w:r>
           </w:p>
         </w:tc>
@@ -15668,15 +15990,7 @@
               <w:spacing w:after="0"/>
             </w:pPr>
             <w:r>
-              <w:rPr>
-                <w:rFonts w:ascii="Arial" w:cs="Arial" w:eastAsia="Arial" w:hAnsi="Arial"/>
-                <w:b/>
-                <w:bCs/>
-                <w:color w:val="FFFFFF"/>
-                <w:sz w:val="19"/>
-                <w:szCs w:val="19"/>
-              </w:rPr>
-              <w:t xml:space="preserve">System Prompt Focus</w:t>
+              <w:t>Purpose</w:t>
             </w:r>
           </w:p>
         </w:tc>
@@ -15703,15 +16017,7 @@
               <w:spacing w:after="0"/>
             </w:pPr>
             <w:r>
-              <w:rPr>
-                <w:rFonts w:ascii="Arial" w:cs="Arial" w:eastAsia="Arial" w:hAnsi="Arial"/>
-                <w:b/>
-                <w:bCs/>
-                <w:color w:val="FFFFFF"/>
-                <w:sz w:val="19"/>
-                <w:szCs w:val="19"/>
-              </w:rPr>
-              <w:t xml:space="preserve">Output</w:t>
+              <w:t>Update Frequency</w:t>
             </w:r>
           </w:p>
         </w:tc>
@@ -15739,15 +16045,7 @@
               <w:spacing w:after="0"/>
             </w:pPr>
             <w:r>
-              <w:rPr>
-                <w:rFonts w:ascii="Arial" w:cs="Arial" w:eastAsia="Arial" w:hAnsi="Arial"/>
-                <w:b w:val="false"/>
-                <w:bCs w:val="false"/>
-                <w:color w:val="222222"/>
-                <w:sz w:val="19"/>
-                <w:szCs w:val="19"/>
-              </w:rPr>
-              <w:t xml:space="preserve">Call 1: Bull Case Agent</w:t>
+              <w:t>Layer 1: Macro Context</w:t>
             </w:r>
           </w:p>
         </w:tc>
@@ -15773,15 +16071,7 @@
               <w:spacing w:after="0"/>
             </w:pPr>
             <w:r>
-              <w:rPr>
-                <w:rFonts w:ascii="Arial" w:cs="Arial" w:eastAsia="Arial" w:hAnsi="Arial"/>
-                <w:b w:val="false"/>
-                <w:bCs w:val="false"/>
-                <w:color w:val="222222"/>
-                <w:sz w:val="19"/>
-                <w:szCs w:val="19"/>
-              </w:rPr>
-              <w:t xml:space="preserve">Build the strongest possible bull case from the data</w:t>
+              <w:t>shared/macro-context.json — single file, same for all stocks</w:t>
             </w:r>
           </w:p>
         </w:tc>
@@ -15807,15 +16097,7 @@
               <w:spacing w:after="0"/>
             </w:pPr>
             <w:r>
-              <w:rPr>
-                <w:rFonts w:ascii="Arial" w:cs="Arial" w:eastAsia="Arial" w:hAnsi="Arial"/>
-                <w:b w:val="false"/>
-                <w:bCs w:val="false"/>
-                <w:color w:val="222222"/>
-                <w:sz w:val="19"/>
-                <w:szCs w:val="19"/>
-              </w:rPr>
-              <w:t xml:space="preserve">You are an optimistic equity analyst. Your task is to construct the strongest investment case FOR this stock using only the provided data. Be specific about numbers, trends, and catalysts.</w:t>
+              <w:t>BI rate + direction, USD/IDR, IDX YTD, foreign flow regime, key upcoming events. Gives the AI time-awareness so analysis is not timeless/generic.</w:t>
             </w:r>
           </w:p>
         </w:tc>
@@ -15841,15 +16123,7 @@
               <w:spacing w:after="0"/>
             </w:pPr>
             <w:r>
-              <w:rPr>
-                <w:rFonts w:ascii="Arial" w:cs="Arial" w:eastAsia="Arial" w:hAnsi="Arial"/>
-                <w:b w:val="false"/>
-                <w:bCs w:val="false"/>
-                <w:color w:val="222222"/>
-                <w:sz w:val="19"/>
-                <w:szCs w:val="19"/>
-              </w:rPr>
-              <w:t xml:space="preserve">bull_case string + 3 bullish_signals</w:t>
+              <w:t>Monthly (manual, ~5 min)</w:t>
             </w:r>
           </w:p>
         </w:tc>
@@ -15878,15 +16152,7 @@
               <w:spacing w:after="0"/>
             </w:pPr>
             <w:r>
-              <w:rPr>
-                <w:rFonts w:ascii="Arial" w:cs="Arial" w:eastAsia="Arial" w:hAnsi="Arial"/>
-                <w:b w:val="false"/>
-                <w:bCs w:val="false"/>
-                <w:color w:val="222222"/>
-                <w:sz w:val="19"/>
-                <w:szCs w:val="19"/>
-              </w:rPr>
-              <w:t xml:space="preserve">Call 2: Bear Case Agent</w:t>
+              <w:t>Layer 2: Sector Template</w:t>
             </w:r>
           </w:p>
         </w:tc>
@@ -15913,15 +16179,7 @@
               <w:spacing w:after="0"/>
             </w:pPr>
             <w:r>
-              <w:rPr>
-                <w:rFonts w:ascii="Arial" w:cs="Arial" w:eastAsia="Arial" w:hAnsi="Arial"/>
-                <w:b w:val="false"/>
-                <w:bCs w:val="false"/>
-                <w:color w:val="222222"/>
-                <w:sz w:val="19"/>
-                <w:szCs w:val="19"/>
-              </w:rPr>
-              <w:t xml:space="preserve">Build the strongest possible bear case</w:t>
+              <w:t>shared/sectors/{subsector}.json — 33 files, one per subsector</w:t>
             </w:r>
           </w:p>
         </w:tc>
@@ -15948,15 +16206,7 @@
               <w:spacing w:after="0"/>
             </w:pPr>
             <w:r>
-              <w:rPr>
-                <w:rFonts w:ascii="Arial" w:cs="Arial" w:eastAsia="Arial" w:hAnsi="Arial"/>
-                <w:b w:val="false"/>
-                <w:bCs w:val="false"/>
-                <w:color w:val="222222"/>
-                <w:sz w:val="19"/>
-                <w:szCs w:val="19"/>
-              </w:rPr>
-              <w:t xml:space="preserve">You are a skeptical risk analyst. Your task is to construct the strongest case AGAINST this stock. Identify every weakness, risk, and red flag in the data.</w:t>
+              <w:t>Key metrics for this sector, valuation methodology, current sector dynamics, sector-specific risks, exemptions (e.g. banking: ignore current_ratio). Prevents bank analysis from discussing current_ratio or coal analysis ignoring commodity cycle.</w:t>
             </w:r>
           </w:p>
         </w:tc>
@@ -15983,15 +16233,7 @@
               <w:spacing w:after="0"/>
             </w:pPr>
             <w:r>
-              <w:rPr>
-                <w:rFonts w:ascii="Arial" w:cs="Arial" w:eastAsia="Arial" w:hAnsi="Arial"/>
-                <w:b w:val="false"/>
-                <w:bCs w:val="false"/>
-                <w:color w:val="222222"/>
-                <w:sz w:val="19"/>
-                <w:szCs w:val="19"/>
-              </w:rPr>
-              <w:t xml:space="preserve">bear_case string + 3 key_risks</w:t>
+              <w:t>Quarterly (manual review)</w:t>
             </w:r>
           </w:p>
         </w:tc>
@@ -16019,15 +16261,7 @@
               <w:spacing w:after="0"/>
             </w:pPr>
             <w:r>
-              <w:rPr>
-                <w:rFonts w:ascii="Arial" w:cs="Arial" w:eastAsia="Arial" w:hAnsi="Arial"/>
-                <w:b w:val="false"/>
-                <w:bCs w:val="false"/>
-                <w:color w:val="222222"/>
-                <w:sz w:val="19"/>
-                <w:szCs w:val="19"/>
-              </w:rPr>
-              <w:t xml:space="preserve">Call 3: Synthesis Agent</w:t>
+              <w:t>Layer 3: Domain Notes (optional)</w:t>
             </w:r>
           </w:p>
         </w:tc>
@@ -16053,15 +16287,7 @@
               <w:spacing w:after="0"/>
             </w:pPr>
             <w:r>
-              <w:rPr>
-                <w:rFonts w:ascii="Arial" w:cs="Arial" w:eastAsia="Arial" w:hAnsi="Arial"/>
-                <w:b w:val="false"/>
-                <w:bCs w:val="false"/>
-                <w:color w:val="222222"/>
-                <w:sz w:val="19"/>
-                <w:szCs w:val="19"/>
-              </w:rPr>
-              <w:t xml:space="preserve">Arbitrate between bull and bear cases</w:t>
+              <w:t>stock_notes table — free-text per ticker, user-written</w:t>
             </w:r>
           </w:p>
         </w:tc>
@@ -16087,15 +16313,7 @@
               <w:spacing w:after="0"/>
             </w:pPr>
             <w:r>
-              <w:rPr>
-                <w:rFonts w:ascii="Arial" w:cs="Arial" w:eastAsia="Arial" w:hAnsi="Arial"/>
-                <w:b w:val="false"/>
-                <w:bCs w:val="false"/>
-                <w:color w:val="222222"/>
-                <w:sz w:val="19"/>
-                <w:szCs w:val="19"/>
-              </w:rPr>
-              <w:t xml:space="preserve">You are a senior equity analyst who has read both a bull case and a bear case for the same stock. Synthesize them into a balanced verdict. You must explicitly state what data is missing and how it would change your view.</w:t>
+              <w:t>2-5 sentences of company-specific context (competitive moat, business model, catalysts). When absent, AI works with data + macro + sector template only and flags limited context. Analysis still useful without it — macro + sector do most of the heavy lifting.</w:t>
             </w:r>
           </w:p>
         </w:tc>
@@ -16121,15 +16339,7 @@
               <w:spacing w:after="0"/>
             </w:pPr>
             <w:r>
-              <w:rPr>
-                <w:rFonts w:ascii="Arial" w:cs="Arial" w:eastAsia="Arial" w:hAnsi="Arial"/>
-                <w:b w:val="false"/>
-                <w:bCs w:val="false"/>
-                <w:color w:val="222222"/>
-                <w:sz w:val="19"/>
-                <w:szCs w:val="19"/>
-              </w:rPr>
-              <w:t xml:space="preserve">Full JSON output per Section 6.3</w:t>
+              <w:t>On demand (user writes when researching)</w:t>
             </w:r>
           </w:p>
         </w:tc>
@@ -16421,62 +16631,100 @@
         <w:ind w:left="280"/>
       </w:pPr>
       <w:r>
-        <w:rPr>
-          <w:rFonts w:ascii="Courier New" w:cs="Courier New" w:eastAsia="Courier New" w:hAnsi="Courier New"/>
-          <w:color w:val="0D2B4E"/>
-          <w:sz w:val="17"/>
-          <w:szCs w:val="17"/>
-        </w:rPr>
-        <w:t xml:space="preserve"/>
-      </w:r>
-    </w:p>
-    <w:p>
-      <w:pPr>
-        <w:shd w:fill="F2F6FC" w:val="clear"/>
-        <w:spacing w:before="0" w:after="0"/>
-        <w:ind w:left="280"/>
-      </w:pPr>
-      <w:r>
-        <w:rPr>
-          <w:rFonts w:ascii="Courier New" w:cs="Courier New" w:eastAsia="Courier New" w:hAnsi="Courier New"/>
-          <w:color w:val="0D2B4E"/>
-          <w:sz w:val="17"/>
-          <w:szCs w:val="17"/>
-        </w:rPr>
-        <w:t xml:space="preserve">Output format: respond ONLY with the JSON schema provided. No markdown,</w:t>
-      </w:r>
-    </w:p>
-    <w:p>
-      <w:pPr>
-        <w:shd w:fill="F2F6FC" w:val="clear"/>
-        <w:spacing w:before="0" w:after="0"/>
-        <w:ind w:left="280"/>
-      </w:pPr>
-      <w:r>
-        <w:rPr>
-          <w:rFonts w:ascii="Courier New" w:cs="Courier New" w:eastAsia="Courier New" w:hAnsi="Courier New"/>
-          <w:color w:val="0D2B4E"/>
-          <w:sz w:val="17"/>
-          <w:szCs w:val="17"/>
-        </w:rPr>
-        <w:t xml:space="preserve">no preamble, no explanation outside the JSON.</w:t>
-      </w:r>
-    </w:p>
-    <w:p>
-      <w:pPr>
-        <w:shd w:fill="F2F6FC" w:val="clear"/>
-        <w:spacing w:before="0" w:after="0"/>
-        <w:ind w:left="280"/>
-      </w:pPr>
-      <w:r>
-        <w:rPr>
-          <w:rFonts w:ascii="Courier New" w:cs="Courier New" w:eastAsia="Courier New" w:hAnsi="Courier New"/>
-          <w:color w:val="0D2B4E"/>
-          <w:sz w:val="17"/>
-          <w:szCs w:val="17"/>
-        </w:rPr>
-        <w:t xml:space="preserve">'''</w:t>
-      </w:r>
+        <w:t>Output Schema (strict JSON — 3-scenario structure)</w:t>
+      </w:r>
+    </w:p>
+    <w:p>
+      <w:pPr>
+        <w:shd w:fill="F2F6FC" w:val="clear"/>
+        <w:spacing w:before="0" w:after="0"/>
+        <w:ind w:left="280"/>
+      </w:pPr>
+      <w:r>
+        <w:t>{</w:t>
+        <w:br/>
+        <w:t xml:space="preserve">  "lynch_category": "&lt;slow_grower|stalwart|fast_grower|cyclical|turnaround|asset_play&gt;",</w:t>
+        <w:br/>
+        <w:t xml:space="preserve">  "lynch_rationale": "&lt;2 sentences&gt;",</w:t>
+        <w:br/>
+        <w:t xml:space="preserve">  "buffett_moat": "&lt;none|narrow|wide&gt;",</w:t>
+        <w:br/>
+        <w:t xml:space="preserve">  "buffett_moat_source": "&lt;1-2 sentences&gt;",</w:t>
+        <w:br/>
+        <w:t xml:space="preserve">  "business_narrative": "&lt;3-4 sentences — the STORY, not the numbers&gt;",</w:t>
+        <w:br/>
+        <w:t xml:space="preserve">  "financial_health_signal": "&lt;improving|stable|deteriorating&gt;",</w:t>
+        <w:br/>
+        <w:t xml:space="preserve">  "bull_case": {</w:t>
+        <w:br/>
+        <w:t xml:space="preserve">    "scenario": "&lt;3-4 sentences: what happens to the business&gt;",</w:t>
+        <w:br/>
+        <w:t xml:space="preserve">    "drivers": ["&lt;specific factor&gt;", "&lt;another&gt;", "&lt;another&gt;"],</w:t>
+        <w:br/>
+        <w:t xml:space="preserve">    "price_target": &lt;number&gt;,</w:t>
+        <w:br/>
+        <w:t xml:space="preserve">    "timeframe": "&lt;6-12m | 1-2y | 2-3y&gt;",</w:t>
+        <w:br/>
+        <w:t xml:space="preserve">    "probability": "&lt;low|medium|high&gt;",</w:t>
+        <w:br/>
+        <w:t xml:space="preserve">    "early_signs": ["&lt;observable sign&gt;", "&lt;another&gt;"]</w:t>
+        <w:br/>
+        <w:t xml:space="preserve">  },</w:t>
+        <w:br/>
+        <w:t xml:space="preserve">  "bear_case": { /* same structure as bull_case */ },</w:t>
+        <w:br/>
+        <w:t xml:space="preserve">  "neutral_case": {</w:t>
+        <w:br/>
+        <w:t xml:space="preserve">    "scenario": "&lt;3-4 sentences: most likely path&gt;",</w:t>
+        <w:br/>
+        <w:t xml:space="preserve">    "drivers": ["&lt;what keeps it here&gt;", "&lt;another&gt;"],</w:t>
+        <w:br/>
+        <w:t xml:space="preserve">    "price_range_low": &lt;number&gt;,</w:t>
+        <w:br/>
+        <w:t xml:space="preserve">    "price_range_high": &lt;number&gt;,</w:t>
+        <w:br/>
+        <w:t xml:space="preserve">    "probability": "&lt;low|medium|high&gt;",</w:t>
+        <w:br/>
+        <w:t xml:space="preserve">    "what_breaks_it": ["&lt;event pushing to bull&gt;", "&lt;event pushing to bear&gt;"]</w:t>
+        <w:br/>
+        <w:t xml:space="preserve">  },</w:t>
+        <w:br/>
+        <w:t xml:space="preserve">  "strategy_fit": {</w:t>
+        <w:br/>
+        <w:t xml:space="preserve">    "primary": "&lt;dividend_income|growth_compounder|deep_value|speculative_growth|turnaround_bet|cyclical_trade|avoid&gt;",</w:t>
+        <w:br/>
+        <w:t xml:space="preserve">    "ideal_investor": "&lt;who, time horizon, position size&gt;",</w:t>
+        <w:br/>
+        <w:t xml:space="preserve">    "position_sizing": "&lt;full_position|half_position|small_speculative|avoid&gt;"</w:t>
+        <w:br/>
+        <w:t xml:space="preserve">  },</w:t>
+        <w:br/>
+        <w:t xml:space="preserve">  "what_to_watch": ["&lt;metric + threshold&gt;", "&lt;another&gt;", "&lt;another&gt;"],</w:t>
+        <w:br/>
+        <w:t xml:space="preserve">  "analyst_verdict": "&lt;strong_buy|buy|hold|avoid|strong_avoid&gt;",</w:t>
+        <w:br/>
+        <w:t xml:space="preserve">  "confidence_level": &lt;1-10&gt;,</w:t>
+        <w:br/>
+        <w:t xml:space="preserve">  "data_gaps_acknowledged": ["&lt;gap + impact&gt;"],</w:t>
+        <w:br/>
+        <w:t xml:space="preserve">  "caveats": ["&lt;warning&gt;"]</w:t>
+        <w:br/>
+        <w:t>}</w:t>
+      </w:r>
+    </w:p>
+    <w:p>
+      <w:pPr>
+        <w:shd w:fill="F2F6FC" w:val="clear"/>
+        <w:spacing w:before="0" w:after="0"/>
+        <w:ind w:left="280"/>
+      </w:pPr>
+    </w:p>
+    <w:p>
+      <w:pPr>
+        <w:shd w:fill="F2F6FC" w:val="clear"/>
+        <w:spacing w:before="0" w:after="0"/>
+        <w:ind w:left="280"/>
+      </w:pPr>
     </w:p>
     <w:p>
       <w:pPr>
@@ -16488,289 +16736,125 @@
         <w:pStyle w:val="Heading4"/>
         <w:spacing w:before="160" w:after="80"/>
       </w:pPr>
-      <w:r>
-        <w:rPr>
-          <w:rFonts w:ascii="Arial" w:cs="Arial" w:eastAsia="Arial" w:hAnsi="Arial"/>
-          <w:b/>
-          <w:bCs/>
-          <w:color w:val="7A5000"/>
-          <w:sz w:val="21"/>
-          <w:szCs w:val="21"/>
-        </w:rPr>
-        <w:t xml:space="preserve">Call 3 Output Schema (strict JSON)</w:t>
-      </w:r>
-    </w:p>
-    <w:p>
-      <w:pPr>
-        <w:shd w:fill="F2F6FC" w:val="clear"/>
-        <w:spacing w:before="0" w:after="0"/>
-        <w:ind w:left="280"/>
-      </w:pPr>
-      <w:r>
-        <w:rPr>
-          <w:rFonts w:ascii="Courier New" w:cs="Courier New" w:eastAsia="Courier New" w:hAnsi="Courier New"/>
-          <w:color w:val="0D2B4E"/>
-          <w:sz w:val="17"/>
-          <w:szCs w:val="17"/>
-        </w:rPr>
-        <w:t xml:space="preserve">{</w:t>
-      </w:r>
-    </w:p>
-    <w:p>
-      <w:pPr>
-        <w:shd w:fill="F2F6FC" w:val="clear"/>
-        <w:spacing w:before="0" w:after="0"/>
-        <w:ind w:left="280"/>
-      </w:pPr>
-      <w:r>
-        <w:rPr>
-          <w:rFonts w:ascii="Courier New" w:cs="Courier New" w:eastAsia="Courier New" w:hAnsi="Courier New"/>
-          <w:color w:val="0D2B4E"/>
-          <w:sz w:val="17"/>
-          <w:szCs w:val="17"/>
-        </w:rPr>
-        <w:t xml:space="preserve">  "business_quality_score":     7.5,         // 1-10</w:t>
-      </w:r>
-    </w:p>
-    <w:p>
-      <w:pPr>
-        <w:shd w:fill="F2F6FC" w:val="clear"/>
-        <w:spacing w:before="0" w:after="0"/>
-        <w:ind w:left="280"/>
-      </w:pPr>
-      <w:r>
-        <w:rPr>
-          <w:rFonts w:ascii="Courier New" w:cs="Courier New" w:eastAsia="Courier New" w:hAnsi="Courier New"/>
-          <w:color w:val="0D2B4E"/>
-          <w:sz w:val="17"/>
-          <w:szCs w:val="17"/>
-        </w:rPr>
-        <w:t xml:space="preserve">  "business_quality_rationale": "...",       // 2-3 sentences</w:t>
-      </w:r>
-    </w:p>
-    <w:p>
-      <w:pPr>
-        <w:shd w:fill="F2F6FC" w:val="clear"/>
-        <w:spacing w:before="0" w:after="0"/>
-        <w:ind w:left="280"/>
-      </w:pPr>
-      <w:r>
-        <w:rPr>
-          <w:rFonts w:ascii="Courier New" w:cs="Courier New" w:eastAsia="Courier New" w:hAnsi="Courier New"/>
-          <w:color w:val="0D2B4E"/>
-          <w:sz w:val="17"/>
-          <w:szCs w:val="17"/>
-        </w:rPr>
-        <w:t xml:space="preserve">  "financial_health_signal":    "improving",  // improving|stable|deteriorating</w:t>
-      </w:r>
-    </w:p>
-    <w:p>
-      <w:pPr>
-        <w:shd w:fill="F2F6FC" w:val="clear"/>
-        <w:spacing w:before="0" w:after="0"/>
-        <w:ind w:left="280"/>
-      </w:pPr>
-      <w:r>
-        <w:rPr>
-          <w:rFonts w:ascii="Courier New" w:cs="Courier New" w:eastAsia="Courier New" w:hAnsi="Courier New"/>
-          <w:color w:val="0D2B4E"/>
-          <w:sz w:val="17"/>
-          <w:szCs w:val="17"/>
-        </w:rPr>
-        <w:t xml:space="preserve">  "key_financial_insights": [</w:t>
-      </w:r>
-    </w:p>
-    <w:p>
-      <w:pPr>
-        <w:shd w:fill="F2F6FC" w:val="clear"/>
-        <w:spacing w:before="0" w:after="0"/>
-        <w:ind w:left="280"/>
-      </w:pPr>
-      <w:r>
-        <w:rPr>
-          <w:rFonts w:ascii="Courier New" w:cs="Courier New" w:eastAsia="Courier New" w:hAnsi="Courier New"/>
-          <w:color w:val="0D2B4E"/>
-          <w:sz w:val="17"/>
-          <w:szCs w:val="17"/>
-        </w:rPr>
-        <w:t xml:space="preserve">    "Revenue CAGR accelerated from 7.7% (10yr) to 10.1% (3yr) — growth is re-rating.",</w:t>
-      </w:r>
-    </w:p>
-    <w:p>
-      <w:pPr>
-        <w:shd w:fill="F2F6FC" w:val="clear"/>
-        <w:spacing w:before="0" w:after="0"/>
-        <w:ind w:left="280"/>
-      </w:pPr>
-      <w:r>
-        <w:rPr>
-          <w:rFonts w:ascii="Courier New" w:cs="Courier New" w:eastAsia="Courier New" w:hAnsi="Courier New"/>
-          <w:color w:val="0D2B4E"/>
-          <w:sz w:val="17"/>
-          <w:szCs w:val="17"/>
-        </w:rPr>
-        <w:t xml:space="preserve">    "FCF/net income at 0.82 — earnings quality solid, no accrual concern.",</w:t>
-      </w:r>
-    </w:p>
-    <w:p>
-      <w:pPr>
-        <w:shd w:fill="F2F6FC" w:val="clear"/>
-        <w:spacing w:before="0" w:after="0"/>
-        <w:ind w:left="280"/>
-      </w:pPr>
-      <w:r>
-        <w:rPr>
-          <w:rFonts w:ascii="Courier New" w:cs="Courier New" w:eastAsia="Courier New" w:hAnsi="Courier New"/>
-          <w:color w:val="0D2B4E"/>
-          <w:sz w:val="17"/>
-          <w:szCs w:val="17"/>
-        </w:rPr>
-        <w:t xml:space="preserve">    "ROE compressing from 25% (2015) to 12% (2024) — dilution effect of retained earnings."</w:t>
-      </w:r>
-    </w:p>
-    <w:p>
-      <w:pPr>
-        <w:shd w:fill="F2F6FC" w:val="clear"/>
-        <w:spacing w:before="0" w:after="0"/>
-        <w:ind w:left="280"/>
-      </w:pPr>
-      <w:r>
-        <w:rPr>
-          <w:rFonts w:ascii="Courier New" w:cs="Courier New" w:eastAsia="Courier New" w:hAnsi="Courier New"/>
-          <w:color w:val="0D2B4E"/>
-          <w:sz w:val="17"/>
-          <w:szCs w:val="17"/>
-        </w:rPr>
-        <w:t xml:space="preserve">  ],</w:t>
-      </w:r>
-    </w:p>
-    <w:p>
-      <w:pPr>
-        <w:shd w:fill="F2F6FC" w:val="clear"/>
-        <w:spacing w:before="0" w:after="0"/>
-        <w:ind w:left="280"/>
-      </w:pPr>
-      <w:r>
-        <w:rPr>
-          <w:rFonts w:ascii="Courier New" w:cs="Courier New" w:eastAsia="Courier New" w:hAnsi="Courier New"/>
-          <w:color w:val="0D2B4E"/>
-          <w:sz w:val="17"/>
-          <w:szCs w:val="17"/>
-        </w:rPr>
-        <w:t xml:space="preserve">  "valuation_verdict":          "cheap",      // cheap|fair|expensive</w:t>
-      </w:r>
-    </w:p>
-    <w:p>
-      <w:pPr>
-        <w:shd w:fill="F2F6FC" w:val="clear"/>
-        <w:spacing w:before="0" w:after="0"/>
-        <w:ind w:left="280"/>
-      </w:pPr>
-      <w:r>
-        <w:rPr>
-          <w:rFonts w:ascii="Courier New" w:cs="Courier New" w:eastAsia="Courier New" w:hAnsi="Courier New"/>
-          <w:color w:val="0D2B4E"/>
-          <w:sz w:val="17"/>
-          <w:szCs w:val="17"/>
-        </w:rPr>
-        <w:t xml:space="preserve">  "margin_of_safety":           0.30,</w:t>
-      </w:r>
-    </w:p>
-    <w:p>
-      <w:pPr>
-        <w:shd w:fill="F2F6FC" w:val="clear"/>
-        <w:spacing w:before="0" w:after="0"/>
-        <w:ind w:left="280"/>
-      </w:pPr>
-      <w:r>
-        <w:rPr>
-          <w:rFonts w:ascii="Courier New" w:cs="Courier New" w:eastAsia="Courier New" w:hAnsi="Courier New"/>
-          <w:color w:val="0D2B4E"/>
-          <w:sz w:val="17"/>
-          <w:szCs w:val="17"/>
-        </w:rPr>
-        <w:t xml:space="preserve">  "bull_case":                  "...",</w:t>
-      </w:r>
-    </w:p>
-    <w:p>
-      <w:pPr>
-        <w:shd w:fill="F2F6FC" w:val="clear"/>
-        <w:spacing w:before="0" w:after="0"/>
-        <w:ind w:left="280"/>
-      </w:pPr>
-      <w:r>
-        <w:rPr>
-          <w:rFonts w:ascii="Courier New" w:cs="Courier New" w:eastAsia="Courier New" w:hAnsi="Courier New"/>
-          <w:color w:val="0D2B4E"/>
-          <w:sz w:val="17"/>
-          <w:szCs w:val="17"/>
-        </w:rPr>
-        <w:t xml:space="preserve">  "bear_case":                  "...",</w:t>
-      </w:r>
-    </w:p>
-    <w:p>
-      <w:pPr>
-        <w:shd w:fill="F2F6FC" w:val="clear"/>
-        <w:spacing w:before="0" w:after="0"/>
-        <w:ind w:left="280"/>
-      </w:pPr>
-      <w:r>
-        <w:rPr>
-          <w:rFonts w:ascii="Courier New" w:cs="Courier New" w:eastAsia="Courier New" w:hAnsi="Courier New"/>
-          <w:color w:val="0D2B4E"/>
-          <w:sz w:val="17"/>
-          <w:szCs w:val="17"/>
-        </w:rPr>
-        <w:t xml:space="preserve">  "key_risks": ["risk1", "risk2", "risk3"],</w:t>
-      </w:r>
-    </w:p>
-    <w:p>
-      <w:pPr>
-        <w:shd w:fill="F2F6FC" w:val="clear"/>
-        <w:spacing w:before="0" w:after="0"/>
-        <w:ind w:left="280"/>
-      </w:pPr>
-      <w:r>
-        <w:rPr>
-          <w:rFonts w:ascii="Courier New" w:cs="Courier New" w:eastAsia="Courier New" w:hAnsi="Courier New"/>
-          <w:color w:val="0D2B4E"/>
-          <w:sz w:val="17"/>
-          <w:szCs w:val="17"/>
-        </w:rPr>
-        <w:t xml:space="preserve">  "analyst_verdict":            "buy",</w:t>
-      </w:r>
-    </w:p>
-    <w:p>
-      <w:pPr>
-        <w:shd w:fill="F2F6FC" w:val="clear"/>
-        <w:spacing w:before="0" w:after="0"/>
-        <w:ind w:left="280"/>
-      </w:pPr>
-      <w:r>
-        <w:rPr>
-          <w:rFonts w:ascii="Courier New" w:cs="Courier New" w:eastAsia="Courier New" w:hAnsi="Courier New"/>
-          <w:color w:val="0D2B4E"/>
-          <w:sz w:val="17"/>
-          <w:szCs w:val="17"/>
-        </w:rPr>
-        <w:t xml:space="preserve">  "entry_price_low":            8500,</w:t>
-      </w:r>
-    </w:p>
-    <w:p>
-      <w:pPr>
-        <w:shd w:fill="F2F6FC" w:val="clear"/>
-        <w:spacing w:before="0" w:after="0"/>
-        <w:ind w:left="280"/>
-      </w:pPr>
-      <w:r>
-        <w:rPr>
-          <w:rFonts w:ascii="Courier New" w:cs="Courier New" w:eastAsia="Courier New" w:hAnsi="Courier New"/>
-          <w:color w:val="0D2B4E"/>
-          <w:sz w:val="17"/>
-          <w:szCs w:val="17"/>
-        </w:rPr>
-        <w:t xml:space="preserve">  "entry_price_high":           9600,</w:t>
-      </w:r>
+    </w:p>
+    <w:p>
+      <w:pPr>
+        <w:shd w:fill="F2F6FC" w:val="clear"/>
+        <w:spacing w:before="0" w:after="0"/>
+        <w:ind w:left="280"/>
+      </w:pPr>
+    </w:p>
+    <w:p>
+      <w:pPr>
+        <w:shd w:fill="F2F6FC" w:val="clear"/>
+        <w:spacing w:before="0" w:after="0"/>
+        <w:ind w:left="280"/>
+      </w:pPr>
+    </w:p>
+    <w:p>
+      <w:pPr>
+        <w:shd w:fill="F2F6FC" w:val="clear"/>
+        <w:spacing w:before="0" w:after="0"/>
+        <w:ind w:left="280"/>
+      </w:pPr>
+    </w:p>
+    <w:p>
+      <w:pPr>
+        <w:shd w:fill="F2F6FC" w:val="clear"/>
+        <w:spacing w:before="0" w:after="0"/>
+        <w:ind w:left="280"/>
+      </w:pPr>
+    </w:p>
+    <w:p>
+      <w:pPr>
+        <w:shd w:fill="F2F6FC" w:val="clear"/>
+        <w:spacing w:before="0" w:after="0"/>
+        <w:ind w:left="280"/>
+      </w:pPr>
+    </w:p>
+    <w:p>
+      <w:pPr>
+        <w:shd w:fill="F2F6FC" w:val="clear"/>
+        <w:spacing w:before="0" w:after="0"/>
+        <w:ind w:left="280"/>
+      </w:pPr>
+    </w:p>
+    <w:p>
+      <w:pPr>
+        <w:shd w:fill="F2F6FC" w:val="clear"/>
+        <w:spacing w:before="0" w:after="0"/>
+        <w:ind w:left="280"/>
+      </w:pPr>
+    </w:p>
+    <w:p>
+      <w:pPr>
+        <w:shd w:fill="F2F6FC" w:val="clear"/>
+        <w:spacing w:before="0" w:after="0"/>
+        <w:ind w:left="280"/>
+      </w:pPr>
+    </w:p>
+    <w:p>
+      <w:pPr>
+        <w:shd w:fill="F2F6FC" w:val="clear"/>
+        <w:spacing w:before="0" w:after="0"/>
+        <w:ind w:left="280"/>
+      </w:pPr>
+    </w:p>
+    <w:p>
+      <w:pPr>
+        <w:shd w:fill="F2F6FC" w:val="clear"/>
+        <w:spacing w:before="0" w:after="0"/>
+        <w:ind w:left="280"/>
+      </w:pPr>
+    </w:p>
+    <w:p>
+      <w:pPr>
+        <w:shd w:fill="F2F6FC" w:val="clear"/>
+        <w:spacing w:before="0" w:after="0"/>
+        <w:ind w:left="280"/>
+      </w:pPr>
+    </w:p>
+    <w:p>
+      <w:pPr>
+        <w:shd w:fill="F2F6FC" w:val="clear"/>
+        <w:spacing w:before="0" w:after="0"/>
+        <w:ind w:left="280"/>
+      </w:pPr>
+    </w:p>
+    <w:p>
+      <w:pPr>
+        <w:shd w:fill="F2F6FC" w:val="clear"/>
+        <w:spacing w:before="0" w:after="0"/>
+        <w:ind w:left="280"/>
+      </w:pPr>
+    </w:p>
+    <w:p>
+      <w:pPr>
+        <w:shd w:fill="F2F6FC" w:val="clear"/>
+        <w:spacing w:before="0" w:after="0"/>
+        <w:ind w:left="280"/>
+      </w:pPr>
+    </w:p>
+    <w:p>
+      <w:pPr>
+        <w:shd w:fill="F2F6FC" w:val="clear"/>
+        <w:spacing w:before="0" w:after="0"/>
+        <w:ind w:left="280"/>
+      </w:pPr>
+    </w:p>
+    <w:p>
+      <w:pPr>
+        <w:shd w:fill="F2F6FC" w:val="clear"/>
+        <w:spacing w:before="0" w:after="0"/>
+        <w:ind w:left="280"/>
+      </w:pPr>
+    </w:p>
+    <w:p>
+      <w:pPr>
+        <w:shd w:fill="F2F6FC" w:val="clear"/>
+        <w:spacing w:before="0" w:after="0"/>
+        <w:ind w:left="280"/>
+      </w:pPr>
     </w:p>
     <w:p>
       <w:pPr>
@@ -17337,15 +17421,192 @@
         <w:ind w:left="360" w:right="360"/>
       </w:pPr>
       <w:r>
-        <w:rPr>
-          <w:rFonts w:ascii="Arial" w:cs="Arial" w:eastAsia="Arial" w:hAnsi="Arial"/>
-          <w:color w:val="7A5000"/>
-          <w:sz w:val="19"/>
-          <w:szCs w:val="19"/>
-        </w:rPr>
-        <w:t xml:space="preserve">⚠  Cost monitoring: Claude Sonnet 4 is ~$0.003 per 1K input tokens + $0.015 per 1K output tokens. A full 3-call chain per ticker costs approximately $0.07-0.12 USD. For 800 stocks, batch analysis costs ~$60-95 USD total. Run selectively: analyze only stocks where ready_for_ai = TRUE and composite_score &gt; 50.</w:t>
-      </w:r>
-    </w:p>
+        <w:t>Cost monitoring: Single enriched call costs ~$0.02-0.04 per ticker (vs $0.07-0.12 for the original 3-call chain). For 800 stocks batch analysis costs ~$16-32 USD total. Run selectively: only where ready_for_ai = TRUE and composite_score &gt; 50.</w:t>
+      </w:r>
+    </w:p>
+    <w:p/>
+    <w:p>
+      <w:r>
+        <w:rPr>
+          <w:rFonts w:ascii="Courier New" w:cs="Courier New" w:eastAsia="Courier New" w:hAnsi="Courier New"/>
+          <w:color w:val="0D2B4E"/>
+          <w:sz w:val="17"/>
+          <w:szCs w:val="17"/>
+        </w:rPr>
+        <w:t xml:space="preserve">6.5 Post-Generation Output Validation</w:t>
+      </w:r>
+    </w:p>
+    <w:p/>
+    <w:p>
+      <w:r>
+        <w:rPr>
+          <w:rFonts w:ascii="Courier New" w:cs="Courier New" w:eastAsia="Courier New" w:hAnsi="Courier New"/>
+          <w:color w:val="0D2B4E"/>
+          <w:sz w:val="17"/>
+          <w:szCs w:val="17"/>
+        </w:rPr>
+        <w:t xml:space="preserve">After Claude returns the JSON output, ai_analyst.py must validate before writing to ai_analysis table. Invalid outputs are retried once; if still invalid, marked as failed with error detail.</w:t>
+      </w:r>
+    </w:p>
+    <w:p/>
+    <w:p>
+      <w:r>
+        <w:rPr>
+          <w:rFonts w:ascii="Courier New" w:cs="Courier New" w:eastAsia="Courier New" w:hAnsi="Courier New"/>
+          <w:color w:val="0D2B4E"/>
+          <w:sz w:val="17"/>
+          <w:szCs w:val="17"/>
+        </w:rPr>
+        <w:t xml:space="preserve">Structural checks:</w:t>
+      </w:r>
+    </w:p>
+    <w:p>
+      <w:r>
+        <w:rPr>
+          <w:rFonts w:ascii="Courier New" w:cs="Courier New" w:eastAsia="Courier New" w:hAnsi="Courier New"/>
+          <w:color w:val="0D2B4E"/>
+          <w:sz w:val="17"/>
+          <w:szCs w:val="17"/>
+        </w:rPr>
+        <w:t xml:space="preserve">  - JSON parseable and all required fields present</w:t>
+      </w:r>
+    </w:p>
+    <w:p>
+      <w:r>
+        <w:rPr>
+          <w:rFonts w:ascii="Courier New" w:cs="Courier New" w:eastAsia="Courier New" w:hAnsi="Courier New"/>
+          <w:color w:val="0D2B4E"/>
+          <w:sz w:val="17"/>
+          <w:szCs w:val="17"/>
+        </w:rPr>
+        <w:t xml:space="preserve">  - lynch_category is one of the 6 valid enum values</w:t>
+      </w:r>
+    </w:p>
+    <w:p>
+      <w:r>
+        <w:rPr>
+          <w:rFonts w:ascii="Courier New" w:cs="Courier New" w:eastAsia="Courier New" w:hAnsi="Courier New"/>
+          <w:color w:val="0D2B4E"/>
+          <w:sz w:val="17"/>
+          <w:szCs w:val="17"/>
+        </w:rPr>
+        <w:t xml:space="preserve">  - analyst_verdict is one of the 5 valid enum values</w:t>
+      </w:r>
+    </w:p>
+    <w:p>
+      <w:r>
+        <w:rPr>
+          <w:rFonts w:ascii="Courier New" w:cs="Courier New" w:eastAsia="Courier New" w:hAnsi="Courier New"/>
+          <w:color w:val="0D2B4E"/>
+          <w:sz w:val="17"/>
+          <w:szCs w:val="17"/>
+        </w:rPr>
+        <w:t xml:space="preserve">  - confidence_level is integer 1-10</w:t>
+      </w:r>
+    </w:p>
+    <w:p/>
+    <w:p>
+      <w:r>
+        <w:rPr>
+          <w:rFonts w:ascii="Courier New" w:cs="Courier New" w:eastAsia="Courier New" w:hAnsi="Courier New"/>
+          <w:color w:val="0D2B4E"/>
+          <w:sz w:val="17"/>
+          <w:szCs w:val="17"/>
+        </w:rPr>
+        <w:t xml:space="preserve">Scenario consistency checks:</w:t>
+      </w:r>
+    </w:p>
+    <w:p>
+      <w:r>
+        <w:rPr>
+          <w:rFonts w:ascii="Courier New" w:cs="Courier New" w:eastAsia="Courier New" w:hAnsi="Courier New"/>
+          <w:color w:val="0D2B4E"/>
+          <w:sz w:val="17"/>
+          <w:szCs w:val="17"/>
+        </w:rPr>
+        <w:t xml:space="preserve">  - bull_case.price_target &gt; neutral_case.price_range_high &gt; bear_case.price_target (scenario ordering)</w:t>
+      </w:r>
+    </w:p>
+    <w:p>
+      <w:r>
+        <w:rPr>
+          <w:rFonts w:ascii="Courier New" w:cs="Courier New" w:eastAsia="Courier New" w:hAnsi="Courier New"/>
+          <w:color w:val="0D2B4E"/>
+          <w:sz w:val="17"/>
+          <w:szCs w:val="17"/>
+        </w:rPr>
+        <w:t xml:space="preserve">  - neutral_case.price_range_low &lt; neutral_case.price_range_high</w:t>
+      </w:r>
+    </w:p>
+    <w:p>
+      <w:r>
+        <w:rPr>
+          <w:rFonts w:ascii="Courier New" w:cs="Courier New" w:eastAsia="Courier New" w:hAnsi="Courier New"/>
+          <w:color w:val="0D2B4E"/>
+          <w:sz w:val="17"/>
+          <w:szCs w:val="17"/>
+        </w:rPr>
+        <w:t xml:space="preserve">  - All price targets are positive and within 5x of current price (catch hallucinated values)</w:t>
+      </w:r>
+    </w:p>
+    <w:p/>
+    <w:p>
+      <w:r>
+        <w:rPr>
+          <w:rFonts w:ascii="Courier New" w:cs="Courier New" w:eastAsia="Courier New" w:hAnsi="Courier New"/>
+          <w:color w:val="0D2B4E"/>
+          <w:sz w:val="17"/>
+          <w:szCs w:val="17"/>
+        </w:rPr>
+        <w:t xml:space="preserve">Data quality alignment checks:</w:t>
+      </w:r>
+    </w:p>
+    <w:p>
+      <w:r>
+        <w:rPr>
+          <w:rFonts w:ascii="Courier New" w:cs="Courier New" w:eastAsia="Courier New" w:hAnsi="Courier New"/>
+          <w:color w:val="0D2B4E"/>
+          <w:sz w:val="17"/>
+          <w:szCs w:val="17"/>
+        </w:rPr>
+        <w:t xml:space="preserve">  - If reliability_grade is C or D: confidence_level should be &lt;= 6 (warn if higher)</w:t>
+      </w:r>
+    </w:p>
+    <w:p>
+      <w:r>
+        <w:rPr>
+          <w:rFonts w:ascii="Courier New" w:cs="Courier New" w:eastAsia="Courier New" w:hAnsi="Courier New"/>
+          <w:color w:val="0D2B4E"/>
+          <w:sz w:val="17"/>
+          <w:szCs w:val="17"/>
+        </w:rPr>
+        <w:t xml:space="preserve">  - If data_gap_flags is non-empty in the context bundle: data_gaps_acknowledged must be non-empty in the output</w:t>
+      </w:r>
+    </w:p>
+    <w:p>
+      <w:r>
+        <w:rPr>
+          <w:rFonts w:ascii="Courier New" w:cs="Courier New" w:eastAsia="Courier New" w:hAnsi="Courier New"/>
+          <w:color w:val="0D2B4E"/>
+          <w:sz w:val="17"/>
+          <w:szCs w:val="17"/>
+        </w:rPr>
+        <w:t xml:space="preserve">  - At least 1 caveat must be present</w:t>
+      </w:r>
+    </w:p>
+    <w:p/>
+    <w:p>
+      <w:r>
+        <w:rPr>
+          <w:rFonts w:ascii="Courier New" w:cs="Courier New" w:eastAsia="Courier New" w:hAnsi="Courier New"/>
+          <w:color w:val="0D2B4E"/>
+          <w:sz w:val="17"/>
+          <w:szCs w:val="17"/>
+        </w:rPr>
+        <w:t xml:space="preserve">If validation fails after retry: write to ai_analysis with analyst_verdict = "error", store the raw output in a validation_errors JSONB column for debugging.</w:t>
+      </w:r>
+    </w:p>
+    <w:p/>
     <w:p>
       <w:r>
         <w:br w:type="page"/>
@@ -19944,6 +20205,972 @@
         <w:br w:type="page"/>
       </w:r>
     </w:p>
+    <w:p/>
+    <w:p/>
+    <w:p>
+      <w:r>
+        <w:t>8.5 Pipeline Debug Panel (AI Pipeline Inspector)</w:t>
+      </w:r>
+    </w:p>
+    <w:p/>
+    <w:p>
+      <w:r>
+        <w:rPr>
+          <w:rFonts w:ascii="Arial" w:cs="Arial" w:eastAsia="Arial" w:hAnsi="Arial"/>
+          <w:sz w:val="20"/>
+          <w:szCs w:val="20"/>
+        </w:rPr>
+        <w:t xml:space="preserve">A collapsible developer/admin panel on the stock detail page (/stock/[ticker]) that exposes the full Phase 6 pipeline state for debugging and context management. Located in the TENTANG section, below DataQualityWidget.</w:t>
+      </w:r>
+    </w:p>
+    <w:p/>
+    <w:p>
+      <w:r>
+        <w:rPr>
+          <w:rFonts w:ascii="Arial" w:cs="Arial" w:eastAsia="Arial" w:hAnsi="Arial"/>
+          <w:sz w:val="20"/>
+          <w:szCs w:val="20"/>
+        </w:rPr>
+        <w:t xml:space="preserve">VISIBILITY CONTROL:</w:t>
+      </w:r>
+    </w:p>
+    <w:p>
+      <w:r>
+        <w:rPr>
+          <w:rFonts w:ascii="Arial" w:cs="Arial" w:eastAsia="Arial" w:hAnsi="Arial"/>
+          <w:sz w:val="20"/>
+          <w:szCs w:val="20"/>
+        </w:rPr>
+        <w:t xml:space="preserve">  The panel is hidden by default. Toggled via a "Pipeline Debug" button that only renders when:</w:t>
+      </w:r>
+    </w:p>
+    <w:p>
+      <w:r>
+        <w:rPr>
+          <w:rFonts w:ascii="Arial" w:cs="Arial" w:eastAsia="Arial" w:hAnsi="Arial"/>
+          <w:sz w:val="20"/>
+          <w:szCs w:val="20"/>
+        </w:rPr>
+        <w:t xml:space="preserve">  - Environment variable NEXT_PUBLIC_SHOW_DEBUG_PANEL=true, OR</w:t>
+      </w:r>
+    </w:p>
+    <w:p>
+      <w:r>
+        <w:rPr>
+          <w:rFonts w:ascii="Arial" w:cs="Arial" w:eastAsia="Arial" w:hAnsi="Arial"/>
+          <w:sz w:val="20"/>
+          <w:szCs w:val="20"/>
+        </w:rPr>
+        <w:t xml:space="preserve">  - URL query parameter ?debug=1 is present</w:t>
+      </w:r>
+    </w:p>
+    <w:p>
+      <w:r>
+        <w:rPr>
+          <w:rFonts w:ascii="Arial" w:cs="Arial" w:eastAsia="Arial" w:hAnsi="Arial"/>
+          <w:sz w:val="20"/>
+          <w:szCs w:val="20"/>
+        </w:rPr>
+        <w:t xml:space="preserve">  When the pipeline is mature and trusted, remove the env var to hide from all users.</w:t>
+      </w:r>
+    </w:p>
+    <w:p/>
+    <w:p>
+      <w:r>
+        <w:rPr>
+          <w:rFonts w:ascii="Arial" w:cs="Arial" w:eastAsia="Arial" w:hAnsi="Arial"/>
+          <w:sz w:val="20"/>
+          <w:szCs w:val="20"/>
+        </w:rPr>
+        <w:t xml:space="preserve">PANEL STRUCTURE — 5 collapsible sections:</w:t>
+      </w:r>
+    </w:p>
+    <w:p/>
+    <w:p>
+      <w:r>
+        <w:rPr>
+          <w:rFonts w:ascii="Arial" w:cs="Arial" w:eastAsia="Arial" w:hAnsi="Arial"/>
+          <w:sz w:val="20"/>
+          <w:szCs w:val="20"/>
+        </w:rPr>
+        <w:t xml:space="preserve">--- Section A: Pipeline Stage Breakdown ---</w:t>
+      </w:r>
+    </w:p>
+    <w:p>
+      <w:r>
+        <w:rPr>
+          <w:rFonts w:ascii="Arial" w:cs="Arial" w:eastAsia="Arial" w:hAnsi="Arial"/>
+          <w:sz w:val="20"/>
+          <w:szCs w:val="20"/>
+        </w:rPr>
+        <w:t xml:space="preserve">Shows the output of each pipeline stage for this ticker. Read-only. Purpose: diagnose where data issues originate.</w:t>
+      </w:r>
+    </w:p>
+    <w:p/>
+    <w:p>
+      <w:r>
+        <w:rPr>
+          <w:rFonts w:ascii="Arial" w:cs="Arial" w:eastAsia="Arial" w:hAnsi="Arial"/>
+          <w:sz w:val="20"/>
+          <w:szCs w:val="20"/>
+        </w:rPr>
+        <w:t xml:space="preserve">Stage 1 — Data Cleaner:</w:t>
+      </w:r>
+    </w:p>
+    <w:p>
+      <w:r>
+        <w:rPr>
+          <w:rFonts w:ascii="Arial" w:cs="Arial" w:eastAsia="Arial" w:hAnsi="Arial"/>
+          <w:sz w:val="20"/>
+          <w:szCs w:val="20"/>
+        </w:rPr>
+        <w:t xml:space="preserve">  - Table: one row per financial year, columns: year, usability_flag (color-coded badge), is_covid, is_ipo, has_anomaly, has_one_time, scale_warning, notes</w:t>
+      </w:r>
+    </w:p>
+    <w:p>
+      <w:r>
+        <w:rPr>
+          <w:rFonts w:ascii="Arial" w:cs="Arial" w:eastAsia="Arial" w:hAnsi="Arial"/>
+          <w:sz w:val="20"/>
+          <w:szCs w:val="20"/>
+        </w:rPr>
+        <w:t xml:space="preserve">  - Summary: "11 years processed, 1 excluded (IPO 2015), 2 flagged (COVID 2020, anomaly 2019)"</w:t>
+      </w:r>
+    </w:p>
+    <w:p>
+      <w:r>
+        <w:rPr>
+          <w:rFonts w:ascii="Arial" w:cs="Arial" w:eastAsia="Arial" w:hAnsi="Arial"/>
+          <w:sz w:val="20"/>
+          <w:szCs w:val="20"/>
+        </w:rPr>
+        <w:t xml:space="preserve">  - Source: data_quality_flags table</w:t>
+      </w:r>
+    </w:p>
+    <w:p/>
+    <w:p>
+      <w:r>
+        <w:rPr>
+          <w:rFonts w:ascii="Arial" w:cs="Arial" w:eastAsia="Arial" w:hAnsi="Arial"/>
+          <w:sz w:val="20"/>
+          <w:szCs w:val="20"/>
+        </w:rPr>
+        <w:t xml:space="preserve">Stage 2 — Normalized Metrics:</w:t>
+      </w:r>
+    </w:p>
+    <w:p>
+      <w:r>
+        <w:rPr>
+          <w:rFonts w:ascii="Arial" w:cs="Arial" w:eastAsia="Arial" w:hAnsi="Arial"/>
+          <w:sz w:val="20"/>
+          <w:szCs w:val="20"/>
+        </w:rPr>
+        <w:t xml:space="preserve">  - Table: 20 rows (one per metric), columns: metric, latest_value, trend (with arrow icon), R², CAGR_full, CAGR_3yr, z_score, percentile, peer_group, peer_count</w:t>
+      </w:r>
+    </w:p>
+    <w:p>
+      <w:r>
+        <w:rPr>
+          <w:rFonts w:ascii="Arial" w:cs="Arial" w:eastAsia="Arial" w:hAnsi="Arial"/>
+          <w:sz w:val="20"/>
+          <w:szCs w:val="20"/>
+        </w:rPr>
+        <w:t xml:space="preserve">  - Missing metrics highlighted in amber. Anomaly years shown as tags.</w:t>
+      </w:r>
+    </w:p>
+    <w:p>
+      <w:r>
+        <w:rPr>
+          <w:rFonts w:ascii="Arial" w:cs="Arial" w:eastAsia="Arial" w:hAnsi="Arial"/>
+          <w:sz w:val="20"/>
+          <w:szCs w:val="20"/>
+        </w:rPr>
+        <w:t xml:space="preserve">  - Source: normalized_metrics table</w:t>
+      </w:r>
+    </w:p>
+    <w:p/>
+    <w:p>
+      <w:r>
+        <w:rPr>
+          <w:rFonts w:ascii="Arial" w:cs="Arial" w:eastAsia="Arial" w:hAnsi="Arial"/>
+          <w:sz w:val="20"/>
+          <w:szCs w:val="20"/>
+        </w:rPr>
+        <w:t xml:space="preserve">Stage 3 — Scoring:</w:t>
+      </w:r>
+    </w:p>
+    <w:p>
+      <w:r>
+        <w:rPr>
+          <w:rFonts w:ascii="Arial" w:cs="Arial" w:eastAsia="Arial" w:hAnsi="Arial"/>
+          <w:sz w:val="20"/>
+          <w:szCs w:val="20"/>
+        </w:rPr>
+        <w:t xml:space="preserve">  - Two side-by-side score cards:</w:t>
+      </w:r>
+    </w:p>
+    <w:p>
+      <w:r>
+        <w:rPr>
+          <w:rFonts w:ascii="Arial" w:cs="Arial" w:eastAsia="Arial" w:hAnsi="Arial"/>
+          <w:sz w:val="20"/>
+          <w:szCs w:val="20"/>
+        </w:rPr>
+        <w:t xml:space="preserve">    Reliability: total/100 + grade badge (A/B/C/D/F) + 5 component bars (completeness, consistency, freshness, source, penalties)</w:t>
+      </w:r>
+    </w:p>
+    <w:p>
+      <w:r>
+        <w:rPr>
+          <w:rFonts w:ascii="Arial" w:cs="Arial" w:eastAsia="Arial" w:hAnsi="Arial"/>
+          <w:sz w:val="20"/>
+          <w:szCs w:val="20"/>
+        </w:rPr>
+        <w:t xml:space="preserve">    Confidence: total/100 + grade badge (HIGH/MEDIUM/LOW) + 6 component bars (signal, trend, depth, peers, valuation, penalty)</w:t>
+      </w:r>
+    </w:p>
+    <w:p>
+      <w:r>
+        <w:rPr>
+          <w:rFonts w:ascii="Arial" w:cs="Arial" w:eastAsia="Arial" w:hAnsi="Arial"/>
+          <w:sz w:val="20"/>
+          <w:szCs w:val="20"/>
+        </w:rPr>
+        <w:t xml:space="preserve">  - Composite score + ready_for_ai badge (green checkmark or red X with reason)</w:t>
+      </w:r>
+    </w:p>
+    <w:p>
+      <w:r>
+        <w:rPr>
+          <w:rFonts w:ascii="Arial" w:cs="Arial" w:eastAsia="Arial" w:hAnsi="Arial"/>
+          <w:sz w:val="20"/>
+          <w:szCs w:val="20"/>
+        </w:rPr>
+        <w:t xml:space="preserve">  - Bullish/bearish/neutral signals list. Data gap flags list.</w:t>
+      </w:r>
+    </w:p>
+    <w:p>
+      <w:r>
+        <w:rPr>
+          <w:rFonts w:ascii="Arial" w:cs="Arial" w:eastAsia="Arial" w:hAnsi="Arial"/>
+          <w:sz w:val="20"/>
+          <w:szCs w:val="20"/>
+        </w:rPr>
+        <w:t xml:space="preserve">  - Source: stock_scores table</w:t>
+      </w:r>
+    </w:p>
+    <w:p/>
+    <w:p>
+      <w:r>
+        <w:rPr>
+          <w:rFonts w:ascii="Arial" w:cs="Arial" w:eastAsia="Arial" w:hAnsi="Arial"/>
+          <w:sz w:val="20"/>
+          <w:szCs w:val="20"/>
+        </w:rPr>
+        <w:t xml:space="preserve">Stage 4 — Context Bundle:</w:t>
+      </w:r>
+    </w:p>
+    <w:p>
+      <w:r>
+        <w:rPr>
+          <w:rFonts w:ascii="Arial" w:cs="Arial" w:eastAsia="Arial" w:hAnsi="Arial"/>
+          <w:sz w:val="20"/>
+          <w:szCs w:val="20"/>
+        </w:rPr>
+        <w:t xml:space="preserve">  - Collapsible JSON viewer showing the full ai_context_cache.context_json</w:t>
+      </w:r>
+    </w:p>
+    <w:p>
+      <w:r>
+        <w:rPr>
+          <w:rFonts w:ascii="Arial" w:cs="Arial" w:eastAsia="Arial" w:hAnsi="Arial"/>
+          <w:sz w:val="20"/>
+          <w:szCs w:val="20"/>
+        </w:rPr>
+        <w:t xml:space="preserve">  - Token estimate display</w:t>
+      </w:r>
+    </w:p>
+    <w:p>
+      <w:r>
+        <w:rPr>
+          <w:rFonts w:ascii="Arial" w:cs="Arial" w:eastAsia="Arial" w:hAnsi="Arial"/>
+          <w:sz w:val="20"/>
+          <w:szCs w:val="20"/>
+        </w:rPr>
+        <w:t xml:space="preserve">  - "Built at" timestamp + "Rebuild" button (triggers /api/stocks/[ticker]/trigger-ai-analysis)</w:t>
+      </w:r>
+    </w:p>
+    <w:p>
+      <w:r>
+        <w:rPr>
+          <w:rFonts w:ascii="Arial" w:cs="Arial" w:eastAsia="Arial" w:hAnsi="Arial"/>
+          <w:sz w:val="20"/>
+          <w:szCs w:val="20"/>
+        </w:rPr>
+        <w:t xml:space="preserve">  - Source: ai_context_cache table</w:t>
+      </w:r>
+    </w:p>
+    <w:p/>
+    <w:p>
+      <w:r>
+        <w:rPr>
+          <w:rFonts w:ascii="Arial" w:cs="Arial" w:eastAsia="Arial" w:hAnsi="Arial"/>
+          <w:sz w:val="20"/>
+          <w:szCs w:val="20"/>
+        </w:rPr>
+        <w:t xml:space="preserve">Stage 5 — AI Analysis Result:</w:t>
+      </w:r>
+    </w:p>
+    <w:p>
+      <w:r>
+        <w:rPr>
+          <w:rFonts w:ascii="Arial" w:cs="Arial" w:eastAsia="Arial" w:hAnsi="Arial"/>
+          <w:sz w:val="20"/>
+          <w:szCs w:val="20"/>
+        </w:rPr>
+        <w:t xml:space="preserve">  - If ai_analysis exists: show lynch_category badge, buffett_moat badge, verdict badge, confidence level</w:t>
+      </w:r>
+    </w:p>
+    <w:p>
+      <w:r>
+        <w:rPr>
+          <w:rFonts w:ascii="Arial" w:cs="Arial" w:eastAsia="Arial" w:hAnsi="Arial"/>
+          <w:sz w:val="20"/>
+          <w:szCs w:val="20"/>
+        </w:rPr>
+        <w:t xml:space="preserve">  - Collapsible: full bull/bear/neutral scenarios, strategy_fit, what_to_watch</w:t>
+      </w:r>
+    </w:p>
+    <w:p>
+      <w:r>
+        <w:rPr>
+          <w:rFonts w:ascii="Arial" w:cs="Arial" w:eastAsia="Arial" w:hAnsi="Arial"/>
+          <w:sz w:val="20"/>
+          <w:szCs w:val="20"/>
+        </w:rPr>
+        <w:t xml:space="preserve">  - "Generated at" timestamp + model version</w:t>
+      </w:r>
+    </w:p>
+    <w:p>
+      <w:r>
+        <w:rPr>
+          <w:rFonts w:ascii="Arial" w:cs="Arial" w:eastAsia="Arial" w:hAnsi="Arial"/>
+          <w:sz w:val="20"/>
+          <w:szCs w:val="20"/>
+        </w:rPr>
+        <w:t xml:space="preserve">  - If not yet run: "AI analysis not generated. Click Rebuild in Stage 4 first." message</w:t>
+      </w:r>
+    </w:p>
+    <w:p>
+      <w:r>
+        <w:rPr>
+          <w:rFonts w:ascii="Arial" w:cs="Arial" w:eastAsia="Arial" w:hAnsi="Arial"/>
+          <w:sz w:val="20"/>
+          <w:szCs w:val="20"/>
+        </w:rPr>
+        <w:t xml:space="preserve">  - Source: ai_analysis table</w:t>
+      </w:r>
+    </w:p>
+    <w:p/>
+    <w:p>
+      <w:r>
+        <w:rPr>
+          <w:rFonts w:ascii="Arial" w:cs="Arial" w:eastAsia="Arial" w:hAnsi="Arial"/>
+          <w:sz w:val="20"/>
+          <w:szCs w:val="20"/>
+        </w:rPr>
+        <w:t xml:space="preserve">--- Section B: Context Layer Editor ---</w:t>
+      </w:r>
+    </w:p>
+    <w:p>
+      <w:r>
+        <w:rPr>
+          <w:rFonts w:ascii="Arial" w:cs="Arial" w:eastAsia="Arial" w:hAnsi="Arial"/>
+          <w:sz w:val="20"/>
+          <w:szCs w:val="20"/>
+        </w:rPr>
+        <w:t xml:space="preserve">The interface for viewing and editing the 3-layer domain context. Editable sections have save buttons.</w:t>
+      </w:r>
+    </w:p>
+    <w:p/>
+    <w:p>
+      <w:r>
+        <w:rPr>
+          <w:rFonts w:ascii="Arial" w:cs="Arial" w:eastAsia="Arial" w:hAnsi="Arial"/>
+          <w:sz w:val="20"/>
+          <w:szCs w:val="20"/>
+        </w:rPr>
+        <w:t xml:space="preserve">Layer 1 — Macro Context (read-only on this page):</w:t>
+      </w:r>
+    </w:p>
+    <w:p>
+      <w:r>
+        <w:rPr>
+          <w:rFonts w:ascii="Arial" w:cs="Arial" w:eastAsia="Arial" w:hAnsi="Arial"/>
+          <w:sz w:val="20"/>
+          <w:szCs w:val="20"/>
+        </w:rPr>
+        <w:t xml:space="preserve">  - Shows current macro context JSON (BI rate, IDR, IDX YTD, foreign flow, key events)</w:t>
+      </w:r>
+    </w:p>
+    <w:p>
+      <w:r>
+        <w:rPr>
+          <w:rFonts w:ascii="Arial" w:cs="Arial" w:eastAsia="Arial" w:hAnsi="Arial"/>
+          <w:sz w:val="20"/>
+          <w:szCs w:val="20"/>
+        </w:rPr>
+        <w:t xml:space="preserve">  - "Last updated" timestamp</w:t>
+      </w:r>
+    </w:p>
+    <w:p>
+      <w:r>
+        <w:rPr>
+          <w:rFonts w:ascii="Arial" w:cs="Arial" w:eastAsia="Arial" w:hAnsi="Arial"/>
+          <w:sz w:val="20"/>
+          <w:szCs w:val="20"/>
+        </w:rPr>
+        <w:t xml:space="preserve">  - Note: "Edit at /admin/macro-context or shared/macro-context.json"</w:t>
+      </w:r>
+    </w:p>
+    <w:p>
+      <w:r>
+        <w:rPr>
+          <w:rFonts w:ascii="Arial" w:cs="Arial" w:eastAsia="Arial" w:hAnsi="Arial"/>
+          <w:sz w:val="20"/>
+          <w:szCs w:val="20"/>
+        </w:rPr>
+        <w:t xml:space="preserve">  - Source: shared/macro-context.json (loaded at build time or from a single-row config table)</w:t>
+      </w:r>
+    </w:p>
+    <w:p/>
+    <w:p>
+      <w:r>
+        <w:rPr>
+          <w:rFonts w:ascii="Arial" w:cs="Arial" w:eastAsia="Arial" w:hAnsi="Arial"/>
+          <w:sz w:val="20"/>
+          <w:szCs w:val="20"/>
+        </w:rPr>
+        <w:t xml:space="preserve">Layer 2 — Sector Template (editable):</w:t>
+      </w:r>
+    </w:p>
+    <w:p>
+      <w:r>
+        <w:rPr>
+          <w:rFonts w:ascii="Arial" w:cs="Arial" w:eastAsia="Arial" w:hAnsi="Arial"/>
+          <w:sz w:val="20"/>
+          <w:szCs w:val="20"/>
+        </w:rPr>
+        <w:t xml:space="preserve">  - Shows the template for this stock's subsector (e.g. "Bank" for BBCA)</w:t>
+      </w:r>
+    </w:p>
+    <w:p>
+      <w:r>
+        <w:rPr>
+          <w:rFonts w:ascii="Arial" w:cs="Arial" w:eastAsia="Arial" w:hAnsi="Arial"/>
+          <w:sz w:val="20"/>
+          <w:szCs w:val="20"/>
+        </w:rPr>
+        <w:t xml:space="preserve">  - Fields: key_metrics (tag list), valuation_method (text), cycle_context (text), current_dynamics (text), common_risks (bullet list), exemptions (text), bumn_note (text if applicable)</w:t>
+      </w:r>
+    </w:p>
+    <w:p>
+      <w:r>
+        <w:rPr>
+          <w:rFonts w:ascii="Arial" w:cs="Arial" w:eastAsia="Arial" w:hAnsi="Arial"/>
+          <w:sz w:val="20"/>
+          <w:szCs w:val="20"/>
+        </w:rPr>
+        <w:t xml:space="preserve">  - "Save" button upserts to sector_templates table or writes to shared/sectors/{subsector}.json</w:t>
+      </w:r>
+    </w:p>
+    <w:p>
+      <w:r>
+        <w:rPr>
+          <w:rFonts w:ascii="Arial" w:cs="Arial" w:eastAsia="Arial" w:hAnsi="Arial"/>
+          <w:sz w:val="20"/>
+          <w:szCs w:val="20"/>
+        </w:rPr>
+        <w:t xml:space="preserve">  - If no template exists for this subsector: show placeholder with "Create Template" button</w:t>
+      </w:r>
+    </w:p>
+    <w:p>
+      <w:r>
+        <w:rPr>
+          <w:rFonts w:ascii="Arial" w:cs="Arial" w:eastAsia="Arial" w:hAnsi="Arial"/>
+          <w:sz w:val="20"/>
+          <w:szCs w:val="20"/>
+        </w:rPr>
+        <w:t xml:space="preserve">  - Template example (shown as hint when creating):</w:t>
+      </w:r>
+    </w:p>
+    <w:p>
+      <w:r>
+        <w:rPr>
+          <w:rFonts w:ascii="Arial" w:cs="Arial" w:eastAsia="Arial" w:hAnsi="Arial"/>
+          <w:sz w:val="20"/>
+          <w:szCs w:val="20"/>
+        </w:rPr>
+        <w:t xml:space="preserve">    key_metrics: "NIM, CASA ratio, NPL, cost-to-income, LDR"</w:t>
+      </w:r>
+    </w:p>
+    <w:p>
+      <w:r>
+        <w:rPr>
+          <w:rFonts w:ascii="Arial" w:cs="Arial" w:eastAsia="Arial" w:hAnsi="Arial"/>
+          <w:sz w:val="20"/>
+          <w:szCs w:val="20"/>
+        </w:rPr>
+        <w:t xml:space="preserve">    valuation_method: "PBV primary, PE secondary. Premium banks 3-5x PBV, mid-tier 1-2x."</w:t>
+      </w:r>
+    </w:p>
+    <w:p>
+      <w:r>
+        <w:rPr>
+          <w:rFonts w:ascii="Arial" w:cs="Arial" w:eastAsia="Arial" w:hAnsi="Arial"/>
+          <w:sz w:val="20"/>
+          <w:szCs w:val="20"/>
+        </w:rPr>
+        <w:t xml:space="preserve">    current_dynamics: "Rate easing benefits high-CASA banks. Digital banking competition intensifying."</w:t>
+      </w:r>
+    </w:p>
+    <w:p>
+      <w:r>
+        <w:rPr>
+          <w:rFonts w:ascii="Arial" w:cs="Arial" w:eastAsia="Arial" w:hAnsi="Arial"/>
+          <w:sz w:val="20"/>
+          <w:szCs w:val="20"/>
+        </w:rPr>
+        <w:t xml:space="preserve">    common_risks: "NPL spike, NIM compression, digital disruption"</w:t>
+      </w:r>
+    </w:p>
+    <w:p/>
+    <w:p>
+      <w:r>
+        <w:rPr>
+          <w:rFonts w:ascii="Arial" w:cs="Arial" w:eastAsia="Arial" w:hAnsi="Arial"/>
+          <w:sz w:val="20"/>
+          <w:szCs w:val="20"/>
+        </w:rPr>
+        <w:t xml:space="preserve">Layer 3 — Domain Notes (editable):</w:t>
+      </w:r>
+    </w:p>
+    <w:p>
+      <w:r>
+        <w:rPr>
+          <w:rFonts w:ascii="Arial" w:cs="Arial" w:eastAsia="Arial" w:hAnsi="Arial"/>
+          <w:sz w:val="20"/>
+          <w:szCs w:val="20"/>
+        </w:rPr>
+        <w:t xml:space="preserve">  - Text area with current stock_notes.domain_notes (or empty state)</w:t>
+      </w:r>
+    </w:p>
+    <w:p>
+      <w:r>
+        <w:rPr>
+          <w:rFonts w:ascii="Arial" w:cs="Arial" w:eastAsia="Arial" w:hAnsi="Arial"/>
+          <w:sz w:val="20"/>
+          <w:szCs w:val="20"/>
+        </w:rPr>
+        <w:t xml:space="preserve">  - "Save" button upserts to stock_notes table</w:t>
+      </w:r>
+    </w:p>
+    <w:p>
+      <w:r>
+        <w:rPr>
+          <w:rFonts w:ascii="Arial" w:cs="Arial" w:eastAsia="Arial" w:hAnsi="Arial"/>
+          <w:sz w:val="20"/>
+          <w:szCs w:val="20"/>
+        </w:rPr>
+        <w:t xml:space="preserve">  - Character count + token estimate</w:t>
+      </w:r>
+    </w:p>
+    <w:p>
+      <w:r>
+        <w:rPr>
+          <w:rFonts w:ascii="Arial" w:cs="Arial" w:eastAsia="Arial" w:hAnsi="Arial"/>
+          <w:sz w:val="20"/>
+          <w:szCs w:val="20"/>
+        </w:rPr>
+        <w:t xml:space="preserve">  - Template example (shown as placeholder text):</w:t>
+      </w:r>
+    </w:p>
+    <w:p>
+      <w:r>
+        <w:rPr>
+          <w:rFonts w:ascii="Arial" w:cs="Arial" w:eastAsia="Arial" w:hAnsi="Arial"/>
+          <w:sz w:val="20"/>
+          <w:szCs w:val="20"/>
+        </w:rPr>
+        <w:t xml:space="preserve">    "BBCA is Indonesia's largest private bank by market cap with the highest CASA ratio (~77%) in the banking sector, giving it the lowest cost of funds. Controlled by the Salim/Djarum group via Dwimuria Investama (54.9%). Key competitive advantage is its transaction banking ecosystem (BCA mobile, Flazz, EDC network) which creates sticky deposits. Current strategic focus: digital ecosystem expansion via blu (neobank) and BCA mobile super-app."</w:t>
+      </w:r>
+    </w:p>
+    <w:p>
+      <w:r>
+        <w:rPr>
+          <w:rFonts w:ascii="Arial" w:cs="Arial" w:eastAsia="Arial" w:hAnsi="Arial"/>
+          <w:sz w:val="20"/>
+          <w:szCs w:val="20"/>
+        </w:rPr>
+        <w:t xml:space="preserve">  - If empty: "No domain notes yet. The AI will work with data + macro + sector template only. Add 2-5 sentences about this company's business model, competitive position, and key differentiators for richer AI analysis."</w:t>
+      </w:r>
+    </w:p>
+    <w:p/>
+    <w:p>
+      <w:r>
+        <w:rPr>
+          <w:rFonts w:ascii="Arial" w:cs="Arial" w:eastAsia="Arial" w:hAnsi="Arial"/>
+          <w:sz w:val="20"/>
+          <w:szCs w:val="20"/>
+        </w:rPr>
+        <w:t xml:space="preserve">--- Section C: Data Freshness (existing, enhanced) ---</w:t>
+      </w:r>
+    </w:p>
+    <w:p>
+      <w:r>
+        <w:rPr>
+          <w:rFonts w:ascii="Arial" w:cs="Arial" w:eastAsia="Arial" w:hAnsi="Arial"/>
+          <w:sz w:val="20"/>
+          <w:szCs w:val="20"/>
+        </w:rPr>
+        <w:t xml:space="preserve">The existing freshness check from the refresh wizard, pulled out as a standalone view:</w:t>
+      </w:r>
+    </w:p>
+    <w:p>
+      <w:r>
+        <w:rPr>
+          <w:rFonts w:ascii="Arial" w:cs="Arial" w:eastAsia="Arial" w:hAnsi="Arial"/>
+          <w:sz w:val="20"/>
+          <w:szCs w:val="20"/>
+        </w:rPr>
+        <w:t xml:space="preserve">  - Per-category freshness status (fresh/stale/missing) with days since last update</w:t>
+      </w:r>
+    </w:p>
+    <w:p>
+      <w:r>
+        <w:rPr>
+          <w:rFonts w:ascii="Arial" w:cs="Arial" w:eastAsia="Arial" w:hAnsi="Arial"/>
+          <w:sz w:val="20"/>
+          <w:szCs w:val="20"/>
+        </w:rPr>
+        <w:t xml:space="preserve">  - "Refresh Data" button opens the existing StockbitRefreshModal</w:t>
+      </w:r>
+    </w:p>
+    <w:p>
+      <w:r>
+        <w:rPr>
+          <w:rFonts w:ascii="Arial" w:cs="Arial" w:eastAsia="Arial" w:hAnsi="Arial"/>
+          <w:sz w:val="20"/>
+          <w:szCs w:val="20"/>
+        </w:rPr>
+        <w:t xml:space="preserve">  - This section already exists in DataQualityWidget — show it here for the debug context</w:t>
+      </w:r>
+    </w:p>
+    <w:p/>
+    <w:p>
+      <w:r>
+        <w:rPr>
+          <w:rFonts w:ascii="Arial" w:cs="Arial" w:eastAsia="Arial" w:hAnsi="Arial"/>
+          <w:sz w:val="20"/>
+          <w:szCs w:val="20"/>
+        </w:rPr>
+        <w:t xml:space="preserve">--- Section D: Raw Data Inspector ---</w:t>
+      </w:r>
+    </w:p>
+    <w:p>
+      <w:r>
+        <w:rPr>
+          <w:rFonts w:ascii="Arial" w:cs="Arial" w:eastAsia="Arial" w:hAnsi="Arial"/>
+          <w:sz w:val="20"/>
+          <w:szCs w:val="20"/>
+        </w:rPr>
+        <w:t xml:space="preserve">  - Dropdown: select a table (financials, daily_prices, broker_flow, bandar_signal, insider_transactions, shareholders)</w:t>
+      </w:r>
+    </w:p>
+    <w:p>
+      <w:r>
+        <w:rPr>
+          <w:rFonts w:ascii="Arial" w:cs="Arial" w:eastAsia="Arial" w:hAnsi="Arial"/>
+          <w:sz w:val="20"/>
+          <w:szCs w:val="20"/>
+        </w:rPr>
+        <w:t xml:space="preserve">  - Shows last 10 rows for this ticker from the selected table, as a compact data table</w:t>
+      </w:r>
+    </w:p>
+    <w:p>
+      <w:r>
+        <w:rPr>
+          <w:rFonts w:ascii="Arial" w:cs="Arial" w:eastAsia="Arial" w:hAnsi="Arial"/>
+          <w:sz w:val="20"/>
+          <w:szCs w:val="20"/>
+        </w:rPr>
+        <w:t xml:space="preserve">  - Purpose: spot-check raw data when Stage 1 or Stage 2 shows unexpected results</w:t>
+      </w:r>
+    </w:p>
+    <w:p>
+      <w:r>
+        <w:rPr>
+          <w:rFonts w:ascii="Arial" w:cs="Arial" w:eastAsia="Arial" w:hAnsi="Arial"/>
+          <w:sz w:val="20"/>
+          <w:szCs w:val="20"/>
+        </w:rPr>
+        <w:t xml:space="preserve">  - Paginated, sortable by date/year</w:t>
+      </w:r>
+    </w:p>
+    <w:p/>
+    <w:p>
+      <w:r>
+        <w:rPr>
+          <w:rFonts w:ascii="Arial" w:cs="Arial" w:eastAsia="Arial" w:hAnsi="Arial"/>
+          <w:sz w:val="20"/>
+          <w:szCs w:val="20"/>
+        </w:rPr>
+        <w:t xml:space="preserve">COMPONENT STRUCTURE:</w:t>
+      </w:r>
+    </w:p>
+    <w:p>
+      <w:r>
+        <w:rPr>
+          <w:rFonts w:ascii="Arial" w:cs="Arial" w:eastAsia="Arial" w:hAnsi="Arial"/>
+          <w:sz w:val="20"/>
+          <w:szCs w:val="20"/>
+        </w:rPr>
+        <w:t xml:space="preserve">  New file: web/src/components/stock/widgets/PipelineDebugWidget.tsx</w:t>
+      </w:r>
+    </w:p>
+    <w:p>
+      <w:r>
+        <w:rPr>
+          <w:rFonts w:ascii="Arial" w:cs="Arial" w:eastAsia="Arial" w:hAnsi="Arial"/>
+          <w:sz w:val="20"/>
+          <w:szCs w:val="20"/>
+        </w:rPr>
+        <w:t xml:space="preserve">  - 'use client' component with mounted guard (contains collapsible sections)</w:t>
+      </w:r>
+    </w:p>
+    <w:p>
+      <w:r>
+        <w:rPr>
+          <w:rFonts w:ascii="Arial" w:cs="Arial" w:eastAsia="Arial" w:hAnsi="Arial"/>
+          <w:sz w:val="20"/>
+          <w:szCs w:val="20"/>
+        </w:rPr>
+        <w:t xml:space="preserve">  - Only renders when debug mode is active</w:t>
+      </w:r>
+    </w:p>
+    <w:p>
+      <w:r>
+        <w:rPr>
+          <w:rFonts w:ascii="Arial" w:cs="Arial" w:eastAsia="Arial" w:hAnsi="Arial"/>
+          <w:sz w:val="20"/>
+          <w:szCs w:val="20"/>
+        </w:rPr>
+        <w:t xml:space="preserve">  - Each section is independently collapsible (default: all collapsed except Stage 3 scoring)</w:t>
+      </w:r>
+    </w:p>
+    <w:p/>
+    <w:p>
+      <w:r>
+        <w:rPr>
+          <w:rFonts w:ascii="Arial" w:cs="Arial" w:eastAsia="Arial" w:hAnsi="Arial"/>
+          <w:sz w:val="20"/>
+          <w:szCs w:val="20"/>
+        </w:rPr>
+        <w:t xml:space="preserve">API ROUTES NEEDED:</w:t>
+      </w:r>
+    </w:p>
+    <w:p>
+      <w:r>
+        <w:rPr>
+          <w:rFonts w:ascii="Arial" w:cs="Arial" w:eastAsia="Arial" w:hAnsi="Arial"/>
+          <w:sz w:val="20"/>
+          <w:szCs w:val="20"/>
+        </w:rPr>
+        <w:t xml:space="preserve">  GET  /api/stocks/[ticker]/pipeline-debug   — returns all Stage 1-5 data in one payload</w:t>
+      </w:r>
+    </w:p>
+    <w:p>
+      <w:r>
+        <w:rPr>
+          <w:rFonts w:ascii="Arial" w:cs="Arial" w:eastAsia="Arial" w:hAnsi="Arial"/>
+          <w:sz w:val="20"/>
+          <w:szCs w:val="20"/>
+        </w:rPr>
+        <w:t xml:space="preserve">  GET  /api/stocks/[ticker]/raw-data/[table] — returns last N rows from specified table</w:t>
+      </w:r>
+    </w:p>
+    <w:p>
+      <w:r>
+        <w:rPr>
+          <w:rFonts w:ascii="Arial" w:cs="Arial" w:eastAsia="Arial" w:hAnsi="Arial"/>
+          <w:sz w:val="20"/>
+          <w:szCs w:val="20"/>
+        </w:rPr>
+        <w:t xml:space="preserve">  GET  /api/admin/macro-context              — returns current macro context JSON</w:t>
+      </w:r>
+    </w:p>
+    <w:p>
+      <w:r>
+        <w:rPr>
+          <w:rFonts w:ascii="Arial" w:cs="Arial" w:eastAsia="Arial" w:hAnsi="Arial"/>
+          <w:sz w:val="20"/>
+          <w:szCs w:val="20"/>
+        </w:rPr>
+        <w:t xml:space="preserve">  GET  /api/admin/sector-template/[subsector] — returns sector template</w:t>
+      </w:r>
+    </w:p>
+    <w:p>
+      <w:r>
+        <w:rPr>
+          <w:rFonts w:ascii="Arial" w:cs="Arial" w:eastAsia="Arial" w:hAnsi="Arial"/>
+          <w:sz w:val="20"/>
+          <w:szCs w:val="20"/>
+        </w:rPr>
+        <w:t xml:space="preserve">  POST /api/admin/sector-template/[subsector] — upserts sector template</w:t>
+      </w:r>
+    </w:p>
+    <w:p>
+      <w:r>
+        <w:rPr>
+          <w:rFonts w:ascii="Arial" w:cs="Arial" w:eastAsia="Arial" w:hAnsi="Arial"/>
+          <w:sz w:val="20"/>
+          <w:szCs w:val="20"/>
+        </w:rPr>
+        <w:t xml:space="preserve">  GET  /api/stocks/[ticker]/domain-notes     — returns stock_notes row</w:t>
+      </w:r>
+    </w:p>
+    <w:p>
+      <w:r>
+        <w:rPr>
+          <w:rFonts w:ascii="Arial" w:cs="Arial" w:eastAsia="Arial" w:hAnsi="Arial"/>
+          <w:sz w:val="20"/>
+          <w:szCs w:val="20"/>
+        </w:rPr>
+        <w:t xml:space="preserve">  POST /api/stocks/[ticker]/domain-notes     — upserts domain_notes</w:t>
+      </w:r>
+    </w:p>
+    <w:p/>
+    <w:p>
+      <w:r>
+        <w:rPr>
+          <w:rFonts w:ascii="Arial" w:cs="Arial" w:eastAsia="Arial" w:hAnsi="Arial"/>
+          <w:sz w:val="20"/>
+          <w:szCs w:val="20"/>
+        </w:rPr>
+        <w:t xml:space="preserve">NEW TABLE: sector_templates (optional — can also be JSON files)</w:t>
+      </w:r>
+    </w:p>
+    <w:p>
+      <w:r>
+        <w:rPr>
+          <w:rFonts w:ascii="Arial" w:cs="Arial" w:eastAsia="Arial" w:hAnsi="Arial"/>
+          <w:sz w:val="20"/>
+          <w:szCs w:val="20"/>
+        </w:rPr>
+        <w:t xml:space="preserve">  CREATE TABLE sector_templates (</w:t>
+      </w:r>
+    </w:p>
+    <w:p>
+      <w:r>
+        <w:rPr>
+          <w:rFonts w:ascii="Arial" w:cs="Arial" w:eastAsia="Arial" w:hAnsi="Arial"/>
+          <w:sz w:val="20"/>
+          <w:szCs w:val="20"/>
+        </w:rPr>
+        <w:t xml:space="preserve">    subsector        TEXT PRIMARY KEY,</w:t>
+      </w:r>
+    </w:p>
+    <w:p>
+      <w:r>
+        <w:rPr>
+          <w:rFonts w:ascii="Arial" w:cs="Arial" w:eastAsia="Arial" w:hAnsi="Arial"/>
+          <w:sz w:val="20"/>
+          <w:szCs w:val="20"/>
+        </w:rPr>
+        <w:t xml:space="preserve">    key_metrics      TEXT,          -- JSON array of metric names</w:t>
+      </w:r>
+    </w:p>
+    <w:p>
+      <w:r>
+        <w:rPr>
+          <w:rFonts w:ascii="Arial" w:cs="Arial" w:eastAsia="Arial" w:hAnsi="Arial"/>
+          <w:sz w:val="20"/>
+          <w:szCs w:val="20"/>
+        </w:rPr>
+        <w:t xml:space="preserve">    valuation_method TEXT,</w:t>
+      </w:r>
+    </w:p>
+    <w:p>
+      <w:r>
+        <w:rPr>
+          <w:rFonts w:ascii="Arial" w:cs="Arial" w:eastAsia="Arial" w:hAnsi="Arial"/>
+          <w:sz w:val="20"/>
+          <w:szCs w:val="20"/>
+        </w:rPr>
+        <w:t xml:space="preserve">    cycle_context    TEXT,</w:t>
+      </w:r>
+    </w:p>
+    <w:p>
+      <w:r>
+        <w:rPr>
+          <w:rFonts w:ascii="Arial" w:cs="Arial" w:eastAsia="Arial" w:hAnsi="Arial"/>
+          <w:sz w:val="20"/>
+          <w:szCs w:val="20"/>
+        </w:rPr>
+        <w:t xml:space="preserve">    current_dynamics TEXT,</w:t>
+      </w:r>
+    </w:p>
+    <w:p>
+      <w:r>
+        <w:rPr>
+          <w:rFonts w:ascii="Arial" w:cs="Arial" w:eastAsia="Arial" w:hAnsi="Arial"/>
+          <w:sz w:val="20"/>
+          <w:szCs w:val="20"/>
+        </w:rPr>
+        <w:t xml:space="preserve">    common_risks     TEXT,          -- JSON array</w:t>
+      </w:r>
+    </w:p>
+    <w:p>
+      <w:r>
+        <w:rPr>
+          <w:rFonts w:ascii="Arial" w:cs="Arial" w:eastAsia="Arial" w:hAnsi="Arial"/>
+          <w:sz w:val="20"/>
+          <w:szCs w:val="20"/>
+        </w:rPr>
+        <w:t xml:space="preserve">    exemptions       TEXT,</w:t>
+      </w:r>
+    </w:p>
+    <w:p>
+      <w:r>
+        <w:rPr>
+          <w:rFonts w:ascii="Arial" w:cs="Arial" w:eastAsia="Arial" w:hAnsi="Arial"/>
+          <w:sz w:val="20"/>
+          <w:szCs w:val="20"/>
+        </w:rPr>
+        <w:t xml:space="preserve">    bumn_note        TEXT,</w:t>
+      </w:r>
+    </w:p>
+    <w:p>
+      <w:r>
+        <w:rPr>
+          <w:rFonts w:ascii="Arial" w:cs="Arial" w:eastAsia="Arial" w:hAnsi="Arial"/>
+          <w:sz w:val="20"/>
+          <w:szCs w:val="20"/>
+        </w:rPr>
+        <w:t xml:space="preserve">    updated_at       TIMESTAMPTZ DEFAULT NOW()</w:t>
+      </w:r>
+    </w:p>
+    <w:p>
+      <w:r>
+        <w:rPr>
+          <w:rFonts w:ascii="Arial" w:cs="Arial" w:eastAsia="Arial" w:hAnsi="Arial"/>
+          <w:sz w:val="20"/>
+          <w:szCs w:val="20"/>
+        </w:rPr>
+        <w:t xml:space="preserve">  );</w:t>
+      </w:r>
+    </w:p>
+    <w:p/>
     <w:p>
       <w:pPr>
         <w:pStyle w:val="Heading1"/>
@@ -20205,15 +21432,7 @@
               <w:spacing w:after="0"/>
             </w:pPr>
             <w:r>
-              <w:rPr>
-                <w:rFonts w:ascii="Arial" w:cs="Arial" w:eastAsia="Arial" w:hAnsi="Arial"/>
-                <w:b w:val="false"/>
-                <w:bCs w:val="false"/>
-                <w:color w:val="222222"/>
-                <w:sz w:val="19"/>
-                <w:szCs w:val="19"/>
-              </w:rPr>
-              <w:t xml:space="preserve">Create Supabase migration: docs/schema-v10-ai-pipeline.sql with 4 new tables: data_quality_flags, normalized_metrics, stock_scores, ai_context_cache, ai_analysis</w:t>
+              <w:t>Create Supabase migration: docs/schema-v11-ai-pipeline.sql with 7 new tables: data_quality_flags, normalized_metrics, stock_scores, ai_context_cache, ai_analysis, stock_notes, sector_templates</w:t>
             </w:r>
           </w:p>
         </w:tc>
@@ -20273,15 +21492,7 @@
               <w:spacing w:after="0"/>
             </w:pPr>
             <w:r>
-              <w:rPr>
-                <w:rFonts w:ascii="Arial" w:cs="Arial" w:eastAsia="Arial" w:hAnsi="Arial"/>
-                <w:b w:val="false"/>
-                <w:bCs w:val="false"/>
-                <w:color w:val="222222"/>
-                <w:sz w:val="19"/>
-                <w:szCs w:val="19"/>
-              </w:rPr>
-              <w:t xml:space="preserve">SELECT tablename FROM pg_tables returns all 5 new table names</w:t>
+              <w:t>SELECT tablename FROM pg_tables returns all 7 new table names</w:t>
             </w:r>
           </w:p>
         </w:tc>
@@ -20897,15 +22108,7 @@
               <w:spacing w:after="0"/>
             </w:pPr>
             <w:r>
-              <w:rPr>
-                <w:rFonts w:ascii="Arial" w:cs="Arial" w:eastAsia="Arial" w:hAnsi="Arial"/>
-                <w:b w:val="false"/>
-                <w:bCs w:val="false"/>
-                <w:color w:val="222222"/>
-                <w:sz w:val="19"/>
-                <w:szCs w:val="19"/>
-              </w:rPr>
-              <w:t xml:space="preserve">Implement ai_analyst.py per Section 6 with 3-call chain and strict JSON output parsing</w:t>
+              <w:t>Implement ai_analyst.py per Section 6 with single enriched call architecture, 3-scenario output schema (bull/bear/neutral), Lynch + Buffett framework integration, and post-generation output validation (Section 6.5).</w:t>
             </w:r>
           </w:p>
         </w:tc>
@@ -21700,6 +22903,48 @@
           <w:p>
             <w:r>
               <w:t>SELECT COUNT(*) FROM stock_scores = number of active stocks. SELECT COUNT(*) FROM stocks WHERE score_version = 'v2' matches active count. No stock has score_version = 'v1' after migration.</w:t>
+            </w:r>
+          </w:p>
+        </w:tc>
+      </w:tr>
+      <w:tr>
+        <w:tc>
+          <w:tcPr>
+            <w:tcW w:type="dxa" w:w="600"/>
+          </w:tcPr>
+          <w:p>
+            <w:r>
+              <w:t>13</w:t>
+            </w:r>
+          </w:p>
+        </w:tc>
+        <w:tc>
+          <w:tcPr>
+            <w:tcW w:type="dxa" w:w="3200"/>
+          </w:tcPr>
+          <w:p>
+            <w:r>
+              <w:t>Implement PipelineDebugWidget per Section 8.5. Create pipeline-debug API route, raw-data inspector, sector template editor, domain notes editor. Wire up debug toggle (env var + query param).</w:t>
+            </w:r>
+          </w:p>
+        </w:tc>
+        <w:tc>
+          <w:tcPr>
+            <w:tcW w:type="dxa" w:w="2800"/>
+          </w:tcPr>
+          <w:p>
+            <w:r>
+              <w:t>components/stock/widgets/PipelineDebugWidget.tsx (new), app/api/stocks/[ticker]/pipeline-debug/route.ts (new), app/api/stocks/[ticker]/raw-data/[table]/route.ts (new), app/api/stocks/[ticker]/domain-notes/route.ts (new), app/api/admin/sector-template/[subsector]/route.ts (new), app/api/admin/macro-context/route.ts (new)</w:t>
+            </w:r>
+          </w:p>
+        </w:tc>
+        <w:tc>
+          <w:tcPr>
+            <w:tcW w:type="dxa" w:w="2760"/>
+          </w:tcPr>
+          <w:p>
+            <w:r>
+              <w:t>Visit /stock/BBCA?debug=1 — debug panel visible with all 5 stage sections. Edit domain notes, save, verify persisted. Edit sector template for Bank subsector, save, verify. Without ?debug=1, panel is hidden.</w:t>
             </w:r>
           </w:p>
         </w:tc>
@@ -23105,15 +24350,7 @@
               <w:spacing w:after="0"/>
             </w:pPr>
             <w:r>
-              <w:rPr>
-                <w:rFonts w:ascii="Arial" w:cs="Arial" w:eastAsia="Arial" w:hAnsi="Arial"/>
-                <w:b w:val="false"/>
-                <w:bCs w:val="false"/>
-                <w:color w:val="222222"/>
-                <w:sz w:val="19"/>
-                <w:szCs w:val="19"/>
-              </w:rPr>
-              <w:t xml:space="preserve">3-call chain</w:t>
+              <w:t>Single enriched call</w:t>
             </w:r>
           </w:p>
         </w:tc>
@@ -23140,15 +24377,7 @@
               <w:spacing w:after="0"/>
             </w:pPr>
             <w:r>
-              <w:rPr>
-                <w:rFonts w:ascii="Arial" w:cs="Arial" w:eastAsia="Arial" w:hAnsi="Arial"/>
-                <w:b w:val="false"/>
-                <w:bCs w:val="false"/>
-                <w:color w:val="222222"/>
-                <w:sz w:val="19"/>
-                <w:szCs w:val="19"/>
-              </w:rPr>
-              <w:t xml:space="preserve">The multi-step Claude API reasoning pattern: Bull Case Agent → Bear Case Agent → Synthesis Agent. Replicates investment committee debate.</w:t>
+              <w:t>The AI analyst architecture: one Claude API call per ticker with 3-layer context injection (macro + sector template + domain notes) producing a 3-scenario output (bull/bear/neutral). Replaces the original 3-call chain (Bull Agent -&gt; Bear Agent -&gt; Synthesis) which produced data summaries.</w:t>
             </w:r>
           </w:p>
         </w:tc>
@@ -24285,6 +25514,160 @@
                 <w:szCs w:val="19"/>
               </w:rPr>
               <w:t xml:space="preserve">0-100 score from signal-confidence.ts (TypeScript) and its Python equivalent in context_builder.py. 5 components: broker magnitude, foreign alignment, bandar confirmation, insider weight, broker concentration.</w:t>
+            </w:r>
+          </w:p>
+        </w:tc>
+      </w:tr>
+      <w:tr>
+        <w:tc>
+          <w:tcPr>
+            <w:tcW w:type="dxa" w:w="2600"/>
+          </w:tcPr>
+          <w:p>
+            <w:r>
+              <w:t>Lynch category</w:t>
+            </w:r>
+          </w:p>
+        </w:tc>
+        <w:tc>
+          <w:tcPr>
+            <w:tcW w:type="dxa" w:w="6760"/>
+          </w:tcPr>
+          <w:p>
+            <w:r>
+              <w:t>Peter Lynch's 6 stock classifications: slow_grower, stalwart, fast_grower, cyclical, turnaround, asset_play. Auto-hinted from data (revenue R², CAGR) then confirmed/overridden by AI analyst.</w:t>
+            </w:r>
+          </w:p>
+        </w:tc>
+      </w:tr>
+      <w:tr>
+        <w:tc>
+          <w:tcPr>
+            <w:tcW w:type="dxa" w:w="2600"/>
+          </w:tcPr>
+          <w:p>
+            <w:r>
+              <w:t>Buffett moat</w:t>
+            </w:r>
+          </w:p>
+        </w:tc>
+        <w:tc>
+          <w:tcPr>
+            <w:tcW w:type="dxa" w:w="6760"/>
+          </w:tcPr>
+          <w:p>
+            <w:r>
+              <w:t>Warren Buffett's competitive advantage assessment: none, narrow, or wide. Based on pricing power, switching costs, network effects, cost advantages, intangible assets.</w:t>
+            </w:r>
+          </w:p>
+        </w:tc>
+      </w:tr>
+      <w:tr>
+        <w:tc>
+          <w:tcPr>
+            <w:tcW w:type="dxa" w:w="2600"/>
+          </w:tcPr>
+          <w:p>
+            <w:r>
+              <w:t>Macro context</w:t>
+            </w:r>
+          </w:p>
+        </w:tc>
+        <w:tc>
+          <w:tcPr>
+            <w:tcW w:type="dxa" w:w="6760"/>
+          </w:tcPr>
+          <w:p>
+            <w:r>
+              <w:t>Layer 1 of the 3-layer context system. Monthly-updated JSON with BI rate, IDR, IDX performance, foreign flow regime. Same for all stocks. Gives AI time-awareness.</w:t>
+            </w:r>
+          </w:p>
+        </w:tc>
+      </w:tr>
+      <w:tr>
+        <w:tc>
+          <w:tcPr>
+            <w:tcW w:type="dxa" w:w="2600"/>
+          </w:tcPr>
+          <w:p>
+            <w:r>
+              <w:t>Sector template</w:t>
+            </w:r>
+          </w:p>
+        </w:tc>
+        <w:tc>
+          <w:tcPr>
+            <w:tcW w:type="dxa" w:w="6760"/>
+          </w:tcPr>
+          <w:p>
+            <w:r>
+              <w:t>Layer 2 of the 3-layer context system. Per-subsector JSON with key metrics, valuation methodology, current dynamics, risks, and exemptions. 33 templates for 33 IDX subsectors.</w:t>
+            </w:r>
+          </w:p>
+        </w:tc>
+      </w:tr>
+      <w:tr>
+        <w:tc>
+          <w:tcPr>
+            <w:tcW w:type="dxa" w:w="2600"/>
+          </w:tcPr>
+          <w:p>
+            <w:r>
+              <w:t>Domain notes</w:t>
+            </w:r>
+          </w:p>
+        </w:tc>
+        <w:tc>
+          <w:tcPr>
+            <w:tcW w:type="dxa" w:w="6760"/>
+          </w:tcPr>
+          <w:p>
+            <w:r>
+              <w:t>Layer 3 of the 3-layer context system. Optional free-text per stock in stock_notes table. 2-5 sentences of company-specific context written by the user. Editable via Pipeline Debug Panel.</w:t>
+            </w:r>
+          </w:p>
+        </w:tc>
+      </w:tr>
+      <w:tr>
+        <w:tc>
+          <w:tcPr>
+            <w:tcW w:type="dxa" w:w="2600"/>
+          </w:tcPr>
+          <w:p>
+            <w:r>
+              <w:t>Pipeline Debug Panel</w:t>
+            </w:r>
+          </w:p>
+        </w:tc>
+        <w:tc>
+          <w:tcPr>
+            <w:tcW w:type="dxa" w:w="6760"/>
+          </w:tcPr>
+          <w:p>
+            <w:r>
+              <w:t>Collapsible admin panel on /stock/[ticker] page showing Stage 1-5 pipeline output, context layer editor, raw data inspector. Hidden by default (NEXT_PUBLIC_SHOW_DEBUG_PANEL=true or ?debug=1).</w:t>
+            </w:r>
+          </w:p>
+        </w:tc>
+      </w:tr>
+      <w:tr>
+        <w:tc>
+          <w:tcPr>
+            <w:tcW w:type="dxa" w:w="2600"/>
+          </w:tcPr>
+          <w:p>
+            <w:r>
+              <w:t>TTM/keystats</w:t>
+            </w:r>
+          </w:p>
+        </w:tc>
+        <w:tc>
+          <w:tcPr>
+            <w:tcW w:type="dxa" w:w="6760"/>
+          </w:tcPr>
+          <w:p>
+            <w:r>
+              <w:t>Trailing twelve months data from Stockbit keystats endpoint. Stored with source="stockbit_keystats" and year=current_year. Excluded from trend/CAGR computation. Used for latest valuation multiples only.</w:t>
             </w:r>
           </w:p>
         </w:tc>

</xml_diff>